<commit_message>
Claude-assisted added Qt6 compatibility
</commit_message>
<xml_diff>
--- a/developer.docx
+++ b/developer.docx
@@ -1,6 +1,6 @@
 
 <file path=word/document.xml><?xml version="1.0" encoding="utf-8"?>
-<w:document xmlns:wpc="http://schemas.microsoft.com/office/word/2010/wordprocessingCanvas" xmlns:cx="http://schemas.microsoft.com/office/drawing/2014/chartex" xmlns:cx1="http://schemas.microsoft.com/office/drawing/2015/9/8/chartex" xmlns:cx2="http://schemas.microsoft.com/office/drawing/2015/10/21/chartex" xmlns:cx3="http://schemas.microsoft.com/office/drawing/2016/5/9/chartex" xmlns:cx4="http://schemas.microsoft.com/office/drawing/2016/5/10/chartex" xmlns:cx5="http://schemas.microsoft.com/office/drawing/2016/5/11/chartex" xmlns:cx6="http://schemas.microsoft.com/office/drawing/2016/5/12/chartex" xmlns:cx7="http://schemas.microsoft.com/office/drawing/2016/5/13/chartex" xmlns:cx8="http://schemas.microsoft.com/office/drawing/2016/5/14/chartex" xmlns:mc="http://schemas.openxmlformats.org/markup-compatibility/2006" xmlns:aink="http://schemas.microsoft.com/office/drawing/2016/ink" xmlns:am3d="http://schemas.microsoft.com/office/drawing/2017/model3d" xmlns:o="urn:schemas-microsoft-com:office:office" xmlns:r="http://schemas.openxmlformats.org/officeDocument/2006/relationships" xmlns:m="http://schemas.openxmlformats.org/officeDocument/2006/math" xmlns:v="urn:schemas-microsoft-com:vml" xmlns:wp14="http://schemas.microsoft.com/office/word/2010/wordprocessingDrawing" xmlns:wp="http://schemas.openxmlformats.org/drawingml/2006/wordprocessingDrawing" xmlns:w10="urn:schemas-microsoft-com:office:word" xmlns:w="http://schemas.openxmlformats.org/wordprocessingml/2006/main" xmlns:w14="http://schemas.microsoft.com/office/word/2010/wordml" xmlns:w15="http://schemas.microsoft.com/office/word/2012/wordml" xmlns:w16cid="http://schemas.microsoft.com/office/word/2016/wordml/cid" xmlns:w16se="http://schemas.microsoft.com/office/word/2015/wordml/symex" xmlns:wpg="http://schemas.microsoft.com/office/word/2010/wordprocessingGroup" xmlns:wpi="http://schemas.microsoft.com/office/word/2010/wordprocessingInk" xmlns:wne="http://schemas.microsoft.com/office/word/2006/wordml" xmlns:wps="http://schemas.microsoft.com/office/word/2010/wordprocessingShape" mc:Ignorable="w14 w15 w16se w16cid wp14">
+<w:document xmlns:wpc="http://schemas.microsoft.com/office/word/2010/wordprocessingCanvas" xmlns:cx="http://schemas.microsoft.com/office/drawing/2014/chartex" xmlns:cx1="http://schemas.microsoft.com/office/drawing/2015/9/8/chartex" xmlns:cx2="http://schemas.microsoft.com/office/drawing/2015/10/21/chartex" xmlns:cx3="http://schemas.microsoft.com/office/drawing/2016/5/9/chartex" xmlns:cx4="http://schemas.microsoft.com/office/drawing/2016/5/10/chartex" xmlns:cx5="http://schemas.microsoft.com/office/drawing/2016/5/11/chartex" xmlns:cx6="http://schemas.microsoft.com/office/drawing/2016/5/12/chartex" xmlns:cx7="http://schemas.microsoft.com/office/drawing/2016/5/13/chartex" xmlns:cx8="http://schemas.microsoft.com/office/drawing/2016/5/14/chartex" xmlns:mc="http://schemas.openxmlformats.org/markup-compatibility/2006" xmlns:aink="http://schemas.microsoft.com/office/drawing/2016/ink" xmlns:am3d="http://schemas.microsoft.com/office/drawing/2017/model3d" xmlns:o="urn:schemas-microsoft-com:office:office" xmlns:oel="http://schemas.microsoft.com/office/2019/extlst" xmlns:r="http://schemas.openxmlformats.org/officeDocument/2006/relationships" xmlns:m="http://schemas.openxmlformats.org/officeDocument/2006/math" xmlns:v="urn:schemas-microsoft-com:vml" xmlns:wp14="http://schemas.microsoft.com/office/word/2010/wordprocessingDrawing" xmlns:wp="http://schemas.openxmlformats.org/drawingml/2006/wordprocessingDrawing" xmlns:w10="urn:schemas-microsoft-com:office:word" xmlns:w="http://schemas.openxmlformats.org/wordprocessingml/2006/main" xmlns:w14="http://schemas.microsoft.com/office/word/2010/wordml" xmlns:w15="http://schemas.microsoft.com/office/word/2012/wordml" xmlns:w16cex="http://schemas.microsoft.com/office/word/2018/wordml/cex" xmlns:w16cid="http://schemas.microsoft.com/office/word/2016/wordml/cid" xmlns:w16="http://schemas.microsoft.com/office/word/2018/wordml" xmlns:w16du="http://schemas.microsoft.com/office/word/2023/wordml/word16du" xmlns:w16sdtdh="http://schemas.microsoft.com/office/word/2020/wordml/sdtdatahash" xmlns:w16se="http://schemas.microsoft.com/office/word/2015/wordml/symex" xmlns:wpg="http://schemas.microsoft.com/office/word/2010/wordprocessingGroup" xmlns:wpi="http://schemas.microsoft.com/office/word/2010/wordprocessingInk" xmlns:wne="http://schemas.microsoft.com/office/word/2006/wordml" xmlns:wps="http://schemas.microsoft.com/office/word/2010/wordprocessingShape" mc:Ignorable="w14 w15 w16se w16cid w16 w16cex w16sdtdh w16du wp14">
   <w:body>
     <w:p>
       <w:pPr>
@@ -37,19 +37,8 @@
           <w:szCs w:val="28"/>
           <w:lang w:val="it-IT" w:eastAsia="en-GB"/>
         </w:rPr>
-        <w:t xml:space="preserve"> funzione </w:t>
-      </w:r>
-      <w:proofErr w:type="spellStart"/>
-      <w:r>
-        <w:rPr>
-          <w:b/>
-          <w:sz w:val="28"/>
-          <w:szCs w:val="28"/>
-          <w:lang w:val="it-IT" w:eastAsia="en-GB"/>
-        </w:rPr>
-        <w:t>CLineCalc</w:t>
-      </w:r>
-      <w:proofErr w:type="spellEnd"/>
+        <w:t xml:space="preserve"> funzione CLineCalc</w:t>
+      </w:r>
     </w:p>
     <w:p>
       <w:pPr>
@@ -251,30 +240,8 @@
         <w:rPr>
           <w:lang w:val="it-IT" w:eastAsia="en-GB"/>
         </w:rPr>
-        <w:t xml:space="preserve">), cos(), </w:t>
-      </w:r>
-      <w:proofErr w:type="spellStart"/>
-      <w:r>
-        <w:rPr>
-          <w:lang w:val="it-IT" w:eastAsia="en-GB"/>
-        </w:rPr>
-        <w:t>exp</w:t>
-      </w:r>
-      <w:proofErr w:type="spellEnd"/>
-      <w:r>
-        <w:rPr>
-          <w:lang w:val="it-IT" w:eastAsia="en-GB"/>
-        </w:rPr>
-        <w:t xml:space="preserve">() </w:t>
-      </w:r>
-      <w:proofErr w:type="spellStart"/>
-      <w:r>
-        <w:rPr>
-          <w:lang w:val="it-IT" w:eastAsia="en-GB"/>
-        </w:rPr>
-        <w:t>ecc</w:t>
-      </w:r>
-      <w:proofErr w:type="spellEnd"/>
+        <w:t>), cos(), exp() ecc</w:t>
+      </w:r>
     </w:p>
     <w:p>
       <w:pPr>
@@ -569,29 +536,14 @@
         <w:rPr>
           <w:lang w:val="it-IT" w:eastAsia="en-GB"/>
         </w:rPr>
-        <w:t>(</w:t>
-      </w:r>
-      <w:proofErr w:type="spellStart"/>
-      <w:r>
-        <w:rPr>
-          <w:lang w:val="it-IT" w:eastAsia="en-GB"/>
-        </w:rPr>
-        <w:t>Q</w:t>
-      </w:r>
-      <w:r>
-        <w:rPr>
-          <w:lang w:val="it-IT" w:eastAsia="en-GB"/>
-        </w:rPr>
-        <w:t>String</w:t>
-      </w:r>
-      <w:proofErr w:type="spellEnd"/>
-      <w:r>
-        <w:rPr>
-          <w:lang w:val="it-IT" w:eastAsia="en-GB"/>
-        </w:rPr>
-        <w:t xml:space="preserve">) da analizzare attraverso </w:t>
-      </w:r>
-      <w:proofErr w:type="spellStart"/>
+        <w:t>(Q</w:t>
+      </w:r>
+      <w:r>
+        <w:rPr>
+          <w:lang w:val="it-IT" w:eastAsia="en-GB"/>
+        </w:rPr>
+        <w:t xml:space="preserve">String) da analizzare attraverso </w:t>
+      </w:r>
       <w:r>
         <w:rPr>
           <w:rFonts w:ascii="Courier New" w:hAnsi="Courier New" w:cs="Courier New"/>
@@ -599,7 +551,6 @@
         </w:rPr>
         <w:t>getLine</w:t>
       </w:r>
-      <w:proofErr w:type="spellEnd"/>
       <w:r>
         <w:rPr>
           <w:lang w:val="it-IT" w:eastAsia="en-GB"/>
@@ -612,7 +563,6 @@
         </w:rPr>
         <w:t xml:space="preserve">Prima occorre specificare la variabile booleana </w:t>
       </w:r>
-      <w:proofErr w:type="spellStart"/>
       <w:r>
         <w:rPr>
           <w:rFonts w:ascii="Courier New" w:hAnsi="Courier New" w:cs="Courier New"/>
@@ -620,7 +570,6 @@
         </w:rPr>
         <w:t>xyNaming</w:t>
       </w:r>
-      <w:proofErr w:type="spellEnd"/>
       <w:r>
         <w:rPr>
           <w:lang w:val="it-IT" w:eastAsia="en-GB"/>
@@ -633,523 +582,444 @@
         </w:rPr>
         <w:t xml:space="preserve">La funzione </w:t>
       </w:r>
-      <w:proofErr w:type="spellStart"/>
       <w:r>
         <w:rPr>
           <w:rFonts w:ascii="Courier New" w:hAnsi="Courier New" w:cs="Courier New"/>
           <w:lang w:val="it-IT" w:eastAsia="en-GB"/>
         </w:rPr>
-        <w:t>getLine</w:t>
-      </w:r>
-      <w:proofErr w:type="spellEnd"/>
+        <w:t xml:space="preserve">getLine </w:t>
+      </w:r>
+      <w:r>
+        <w:rPr>
+          <w:lang w:val="it-IT" w:eastAsia="en-GB"/>
+        </w:rPr>
+        <w:t>fa fasi A e B.</w:t>
+      </w:r>
+    </w:p>
+    <w:p>
+      <w:pPr>
+        <w:ind w:left="284" w:hanging="284"/>
+        <w:rPr>
+          <w:lang w:val="it-IT" w:eastAsia="en-GB"/>
+        </w:rPr>
+      </w:pPr>
+      <w:r>
+        <w:rPr>
+          <w:lang w:val="it-IT" w:eastAsia="en-GB"/>
+        </w:rPr>
+        <w:t xml:space="preserve">2) si passa il vettore dei nomi </w:t>
+      </w:r>
+      <w:r>
+        <w:rPr>
+          <w:lang w:val="it-IT" w:eastAsia="en-GB"/>
+        </w:rPr>
+        <w:t xml:space="preserve">e la relativa matrice dei valori con </w:t>
+      </w:r>
       <w:r>
         <w:rPr>
           <w:rFonts w:ascii="Courier New" w:hAnsi="Courier New" w:cs="Courier New"/>
           <w:lang w:val="it-IT" w:eastAsia="en-GB"/>
         </w:rPr>
-        <w:t xml:space="preserve"> </w:t>
-      </w:r>
-      <w:r>
-        <w:rPr>
-          <w:lang w:val="it-IT" w:eastAsia="en-GB"/>
-        </w:rPr>
-        <w:t>fa fasi A e B.</w:t>
+        <w:t>getNamesAndMatrix</w:t>
+      </w:r>
+      <w:r>
+        <w:rPr>
+          <w:lang w:val="it-IT" w:eastAsia="en-GB"/>
+        </w:rPr>
+        <w:t>;</w:t>
+      </w:r>
+      <w:r>
+        <w:rPr>
+          <w:lang w:val="it-IT" w:eastAsia="en-GB"/>
+        </w:rPr>
+        <w:t xml:space="preserve"> </w:t>
+      </w:r>
+      <w:r>
+        <w:rPr>
+          <w:lang w:val="it-IT" w:eastAsia="en-GB"/>
+        </w:rPr>
+        <w:t>Esistono due versioni overload di questa funzion</w:t>
+      </w:r>
+      <w:r>
+        <w:rPr>
+          <w:lang w:val="it-IT" w:eastAsia="en-GB"/>
+        </w:rPr>
+        <w:t>e</w:t>
+      </w:r>
+      <w:r>
+        <w:rPr>
+          <w:lang w:val="it-IT" w:eastAsia="en-GB"/>
+        </w:rPr>
+        <w:t>. Quella più compatta è usata in funplot, quella piùcompleta in PlotXY (vedi esempi qui sotto)</w:t>
       </w:r>
     </w:p>
     <w:p>
       <w:pPr>
         <w:ind w:left="284" w:hanging="284"/>
         <w:rPr>
-          <w:lang w:val="it-IT" w:eastAsia="en-GB"/>
-        </w:rPr>
-      </w:pPr>
-      <w:r>
-        <w:rPr>
-          <w:lang w:val="it-IT" w:eastAsia="en-GB"/>
-        </w:rPr>
-        <w:t xml:space="preserve">2) si passa il vettore dei nomi </w:t>
-      </w:r>
-      <w:r>
-        <w:rPr>
-          <w:lang w:val="it-IT" w:eastAsia="en-GB"/>
-        </w:rPr>
-        <w:t xml:space="preserve">e la relativa matrice dei valori con </w:t>
-      </w:r>
-      <w:proofErr w:type="spellStart"/>
+          <w:u w:val="single"/>
+          <w:lang w:val="it-IT" w:eastAsia="en-GB"/>
+        </w:rPr>
+      </w:pPr>
+      <w:r>
+        <w:rPr>
+          <w:lang w:val="it-IT" w:eastAsia="en-GB"/>
+        </w:rPr>
+        <w:t>3</w:t>
+      </w:r>
+      <w:r>
+        <w:rPr>
+          <w:lang w:val="it-IT" w:eastAsia="en-GB"/>
+        </w:rPr>
+        <w:t>)</w:t>
+      </w:r>
+      <w:r>
+        <w:rPr>
+          <w:lang w:val="it-IT" w:eastAsia="en-GB"/>
+        </w:rPr>
+        <w:tab/>
+      </w:r>
+      <w:r>
+        <w:rPr>
+          <w:lang w:val="it-IT" w:eastAsia="en-GB"/>
+        </w:rPr>
+        <w:t>con</w:t>
+      </w:r>
+      <w:r>
+        <w:rPr>
+          <w:color w:val="C0C0C0"/>
+          <w:lang w:val="it-IT" w:eastAsia="en-GB"/>
+        </w:rPr>
+        <w:t xml:space="preserve"> </w:t>
+      </w:r>
+      <w:r>
+        <w:rPr>
+          <w:lang w:val="it-IT" w:eastAsia="en-GB"/>
+        </w:rPr>
+        <w:t>i</w:t>
+      </w:r>
+      <w:r>
+        <w:rPr>
+          <w:color w:val="C0C0C0"/>
+          <w:lang w:val="it-IT" w:eastAsia="en-GB"/>
+        </w:rPr>
+        <w:t xml:space="preserve"> </w:t>
+      </w:r>
+      <w:r>
+        <w:rPr>
+          <w:lang w:val="it-IT" w:eastAsia="en-GB"/>
+        </w:rPr>
+        <w:t>che</w:t>
+      </w:r>
+      <w:r>
+        <w:rPr>
+          <w:color w:val="C0C0C0"/>
+          <w:lang w:val="it-IT" w:eastAsia="en-GB"/>
+        </w:rPr>
+        <w:t xml:space="preserve"> </w:t>
+      </w:r>
+      <w:r>
+        <w:rPr>
+          <w:lang w:val="it-IT" w:eastAsia="en-GB"/>
+        </w:rPr>
+        <w:t>va</w:t>
+      </w:r>
+      <w:r>
+        <w:rPr>
+          <w:color w:val="C0C0C0"/>
+          <w:lang w:val="it-IT" w:eastAsia="en-GB"/>
+        </w:rPr>
+        <w:t xml:space="preserve"> </w:t>
+      </w:r>
+      <w:r>
+        <w:rPr>
+          <w:lang w:val="it-IT" w:eastAsia="en-GB"/>
+        </w:rPr>
+        <w:t>da</w:t>
+      </w:r>
+      <w:r>
+        <w:rPr>
+          <w:color w:val="C0C0C0"/>
+          <w:lang w:val="it-IT" w:eastAsia="en-GB"/>
+        </w:rPr>
+        <w:t xml:space="preserve"> </w:t>
+      </w:r>
+      <w:r>
+        <w:rPr>
+          <w:lang w:val="it-IT" w:eastAsia="en-GB"/>
+        </w:rPr>
+        <w:t>0</w:t>
+      </w:r>
+      <w:r>
+        <w:rPr>
+          <w:color w:val="C0C0C0"/>
+          <w:lang w:val="it-IT" w:eastAsia="en-GB"/>
+        </w:rPr>
+        <w:t xml:space="preserve"> </w:t>
+      </w:r>
+      <w:r>
+        <w:rPr>
+          <w:lang w:val="it-IT" w:eastAsia="en-GB"/>
+        </w:rPr>
+        <w:t>a</w:t>
+      </w:r>
+      <w:r>
+        <w:rPr>
+          <w:color w:val="C0C0C0"/>
+          <w:lang w:val="it-IT" w:eastAsia="en-GB"/>
+        </w:rPr>
+        <w:t xml:space="preserve"> </w:t>
+      </w:r>
+      <w:r>
+        <w:rPr>
+          <w:lang w:val="it-IT" w:eastAsia="en-GB"/>
+        </w:rPr>
+        <w:t>size-1</w:t>
+      </w:r>
+      <w:r>
+        <w:rPr>
+          <w:color w:val="C0C0C0"/>
+          <w:lang w:val="it-IT" w:eastAsia="en-GB"/>
+        </w:rPr>
+        <w:t xml:space="preserve"> </w:t>
+      </w:r>
+      <w:r>
+        <w:rPr>
+          <w:lang w:val="it-IT" w:eastAsia="en-GB"/>
+        </w:rPr>
+        <w:t>si</w:t>
+      </w:r>
+      <w:r>
+        <w:rPr>
+          <w:color w:val="C0C0C0"/>
+          <w:lang w:val="it-IT" w:eastAsia="en-GB"/>
+        </w:rPr>
+        <w:t xml:space="preserve"> </w:t>
+      </w:r>
+      <w:r>
+        <w:rPr>
+          <w:lang w:val="it-IT" w:eastAsia="en-GB"/>
+        </w:rPr>
+        <w:t>fa</w:t>
+      </w:r>
+      <w:r>
+        <w:rPr>
+          <w:color w:val="C0C0C0"/>
+          <w:lang w:val="it-IT" w:eastAsia="en-GB"/>
+        </w:rPr>
+        <w:t xml:space="preserve"> </w:t>
+      </w:r>
+      <w:r>
+        <w:rPr>
+          <w:lang w:val="it-IT" w:eastAsia="en-GB"/>
+        </w:rPr>
+        <w:t>result[i]=compute(i);</w:t>
+      </w:r>
+      <w:r>
+        <w:rPr>
+          <w:color w:val="C0C0C0"/>
+          <w:lang w:val="it-IT" w:eastAsia="en-GB"/>
+        </w:rPr>
+        <w:t xml:space="preserve"> </w:t>
+      </w:r>
+      <w:r>
+        <w:rPr>
+          <w:lang w:val="it-IT" w:eastAsia="en-GB"/>
+        </w:rPr>
+        <w:t>COMPUTE FA LA FASE C</w:t>
+      </w:r>
+    </w:p>
+    <w:p>
+      <w:pPr>
+        <w:ind w:left="284" w:hanging="284"/>
+        <w:rPr>
+          <w:lang w:val="it-IT" w:eastAsia="en-GB"/>
+        </w:rPr>
+      </w:pPr>
+    </w:p>
+    <w:p>
+      <w:pPr>
+        <w:ind w:left="284" w:hanging="284"/>
+        <w:rPr>
+          <w:lang w:val="it-IT" w:eastAsia="en-GB"/>
+        </w:rPr>
+      </w:pPr>
+      <w:r>
+        <w:rPr>
+          <w:lang w:val="it-IT" w:eastAsia="en-GB"/>
+        </w:rPr>
+        <w:t>eventuali</w:t>
+      </w:r>
+      <w:r>
+        <w:rPr>
+          <w:color w:val="C0C0C0"/>
+          <w:lang w:val="it-IT" w:eastAsia="en-GB"/>
+        </w:rPr>
+        <w:t xml:space="preserve"> </w:t>
+      </w:r>
+      <w:r>
+        <w:rPr>
+          <w:lang w:val="it-IT" w:eastAsia="en-GB"/>
+        </w:rPr>
+        <w:t>messaggi</w:t>
+      </w:r>
+      <w:r>
+        <w:rPr>
+          <w:color w:val="C0C0C0"/>
+          <w:lang w:val="it-IT" w:eastAsia="en-GB"/>
+        </w:rPr>
+        <w:t xml:space="preserve"> </w:t>
+      </w:r>
+      <w:r>
+        <w:rPr>
+          <w:lang w:val="it-IT" w:eastAsia="en-GB"/>
+        </w:rPr>
+        <w:t>di</w:t>
+      </w:r>
+      <w:r>
+        <w:rPr>
+          <w:color w:val="C0C0C0"/>
+          <w:lang w:val="it-IT" w:eastAsia="en-GB"/>
+        </w:rPr>
+        <w:t xml:space="preserve"> </w:t>
+      </w:r>
+      <w:r>
+        <w:rPr>
+          <w:lang w:val="it-IT" w:eastAsia="en-GB"/>
+        </w:rPr>
+        <w:t>errore</w:t>
+      </w:r>
+      <w:r>
+        <w:rPr>
+          <w:color w:val="C0C0C0"/>
+          <w:lang w:val="it-IT" w:eastAsia="en-GB"/>
+        </w:rPr>
+        <w:t xml:space="preserve"> </w:t>
+      </w:r>
+      <w:r>
+        <w:rPr>
+          <w:lang w:val="it-IT" w:eastAsia="en-GB"/>
+        </w:rPr>
+        <w:t>si</w:t>
+      </w:r>
+      <w:r>
+        <w:rPr>
+          <w:color w:val="C0C0C0"/>
+          <w:lang w:val="it-IT" w:eastAsia="en-GB"/>
+        </w:rPr>
+        <w:t xml:space="preserve"> </w:t>
+      </w:r>
+      <w:r>
+        <w:rPr>
+          <w:lang w:val="it-IT" w:eastAsia="en-GB"/>
+        </w:rPr>
+        <w:t>trovano</w:t>
+      </w:r>
+      <w:r>
+        <w:rPr>
+          <w:color w:val="C0C0C0"/>
+          <w:lang w:val="it-IT" w:eastAsia="en-GB"/>
+        </w:rPr>
+        <w:t xml:space="preserve"> </w:t>
+      </w:r>
+      <w:r>
+        <w:rPr>
+          <w:lang w:val="it-IT" w:eastAsia="en-GB"/>
+        </w:rPr>
+        <w:t>nella</w:t>
+      </w:r>
+      <w:r>
+        <w:rPr>
+          <w:color w:val="C0C0C0"/>
+          <w:lang w:val="it-IT" w:eastAsia="en-GB"/>
+        </w:rPr>
+        <w:t xml:space="preserve"> </w:t>
+      </w:r>
+      <w:r>
+        <w:rPr>
+          <w:lang w:val="it-IT" w:eastAsia="en-GB"/>
+        </w:rPr>
+        <w:t>QString,</w:t>
+      </w:r>
+      <w:r>
+        <w:rPr>
+          <w:color w:val="C0C0C0"/>
+          <w:lang w:val="it-IT" w:eastAsia="en-GB"/>
+        </w:rPr>
+        <w:t xml:space="preserve"> </w:t>
+      </w:r>
+      <w:r>
+        <w:rPr>
+          <w:lang w:val="it-IT" w:eastAsia="en-GB"/>
+        </w:rPr>
+        <w:t>interna</w:t>
+      </w:r>
+      <w:r>
+        <w:rPr>
+          <w:color w:val="C0C0C0"/>
+          <w:lang w:val="it-IT" w:eastAsia="en-GB"/>
+        </w:rPr>
+        <w:t xml:space="preserve"> </w:t>
+      </w:r>
+      <w:r>
+        <w:rPr>
+          <w:lang w:val="it-IT" w:eastAsia="en-GB"/>
+        </w:rPr>
+        <w:t>ma</w:t>
+      </w:r>
+      <w:r>
+        <w:rPr>
+          <w:color w:val="C0C0C0"/>
+          <w:lang w:val="it-IT" w:eastAsia="en-GB"/>
+        </w:rPr>
+        <w:t xml:space="preserve"> </w:t>
+      </w:r>
+      <w:r>
+        <w:rPr>
+          <w:lang w:val="it-IT" w:eastAsia="en-GB"/>
+        </w:rPr>
+        <w:t>pubblica,</w:t>
+      </w:r>
+      <w:r>
+        <w:rPr>
+          <w:color w:val="C0C0C0"/>
+          <w:lang w:val="it-IT" w:eastAsia="en-GB"/>
+        </w:rPr>
+        <w:t xml:space="preserve"> </w:t>
+      </w:r>
+      <w:r>
+        <w:rPr>
+          <w:lang w:val="it-IT" w:eastAsia="en-GB"/>
+        </w:rPr>
+        <w:t>di</w:t>
+      </w:r>
+      <w:r>
+        <w:rPr>
+          <w:color w:val="C0C0C0"/>
+          <w:lang w:val="it-IT" w:eastAsia="en-GB"/>
+        </w:rPr>
+        <w:t xml:space="preserve"> </w:t>
+      </w:r>
+      <w:r>
+        <w:rPr>
+          <w:lang w:val="it-IT" w:eastAsia="en-GB"/>
+        </w:rPr>
+        <w:t>nome</w:t>
+      </w:r>
+      <w:r>
+        <w:rPr>
+          <w:color w:val="C0C0C0"/>
+          <w:lang w:val="it-IT" w:eastAsia="en-GB"/>
+        </w:rPr>
+        <w:t xml:space="preserve"> </w:t>
+      </w:r>
       <w:r>
         <w:rPr>
           <w:rFonts w:ascii="Courier New" w:hAnsi="Courier New" w:cs="Courier New"/>
           <w:lang w:val="it-IT" w:eastAsia="en-GB"/>
         </w:rPr>
-        <w:t>getNamesAndMatrix</w:t>
-      </w:r>
-      <w:proofErr w:type="spellEnd"/>
-      <w:r>
-        <w:rPr>
-          <w:lang w:val="it-IT" w:eastAsia="en-GB"/>
-        </w:rPr>
-        <w:t>;</w:t>
-      </w:r>
-      <w:r>
-        <w:rPr>
-          <w:lang w:val="it-IT" w:eastAsia="en-GB"/>
-        </w:rPr>
-        <w:t xml:space="preserve"> </w:t>
-      </w:r>
-      <w:r>
-        <w:rPr>
-          <w:lang w:val="it-IT" w:eastAsia="en-GB"/>
-        </w:rPr>
-        <w:t xml:space="preserve">Esistono due versioni </w:t>
-      </w:r>
-      <w:proofErr w:type="spellStart"/>
-      <w:r>
-        <w:rPr>
-          <w:lang w:val="it-IT" w:eastAsia="en-GB"/>
-        </w:rPr>
-        <w:t>overload</w:t>
-      </w:r>
-      <w:proofErr w:type="spellEnd"/>
-      <w:r>
-        <w:rPr>
-          <w:lang w:val="it-IT" w:eastAsia="en-GB"/>
-        </w:rPr>
-        <w:t xml:space="preserve"> di questa </w:t>
-      </w:r>
-      <w:proofErr w:type="spellStart"/>
-      <w:r>
-        <w:rPr>
-          <w:lang w:val="it-IT" w:eastAsia="en-GB"/>
-        </w:rPr>
-        <w:t>funzion</w:t>
-      </w:r>
-      <w:proofErr w:type="spellEnd"/>
-      <w:r>
-        <w:rPr>
-          <w:lang w:val="it-IT" w:eastAsia="en-GB"/>
-        </w:rPr>
-        <w:t xml:space="preserve">. Quella più compatta è usata in </w:t>
-      </w:r>
-      <w:proofErr w:type="spellStart"/>
-      <w:r>
-        <w:rPr>
-          <w:lang w:val="it-IT" w:eastAsia="en-GB"/>
-        </w:rPr>
-        <w:t>funplot</w:t>
-      </w:r>
-      <w:proofErr w:type="spellEnd"/>
-      <w:r>
-        <w:rPr>
-          <w:lang w:val="it-IT" w:eastAsia="en-GB"/>
-        </w:rPr>
-        <w:t xml:space="preserve">, quella </w:t>
-      </w:r>
-      <w:proofErr w:type="spellStart"/>
-      <w:r>
-        <w:rPr>
-          <w:lang w:val="it-IT" w:eastAsia="en-GB"/>
-        </w:rPr>
-        <w:t>piùcompleta</w:t>
-      </w:r>
-      <w:proofErr w:type="spellEnd"/>
-      <w:r>
-        <w:rPr>
-          <w:lang w:val="it-IT" w:eastAsia="en-GB"/>
-        </w:rPr>
-        <w:t xml:space="preserve"> in </w:t>
-      </w:r>
-      <w:proofErr w:type="spellStart"/>
-      <w:r>
-        <w:rPr>
-          <w:lang w:val="it-IT" w:eastAsia="en-GB"/>
-        </w:rPr>
-        <w:t>PlotXY</w:t>
-      </w:r>
-      <w:proofErr w:type="spellEnd"/>
-      <w:r>
-        <w:rPr>
-          <w:lang w:val="it-IT" w:eastAsia="en-GB"/>
-        </w:rPr>
-        <w:t xml:space="preserve"> (vedi esempi qui sotto)</w:t>
-      </w:r>
-    </w:p>
-    <w:p>
-      <w:pPr>
-        <w:ind w:left="284" w:hanging="284"/>
-        <w:rPr>
-          <w:u w:val="single"/>
-          <w:lang w:val="it-IT" w:eastAsia="en-GB"/>
-        </w:rPr>
-      </w:pPr>
-      <w:r>
-        <w:rPr>
-          <w:lang w:val="it-IT" w:eastAsia="en-GB"/>
-        </w:rPr>
-        <w:t>3</w:t>
-      </w:r>
-      <w:r>
-        <w:rPr>
-          <w:lang w:val="it-IT" w:eastAsia="en-GB"/>
-        </w:rPr>
-        <w:t>)</w:t>
-      </w:r>
-      <w:r>
-        <w:rPr>
-          <w:lang w:val="it-IT" w:eastAsia="en-GB"/>
-        </w:rPr>
-        <w:tab/>
-      </w:r>
-      <w:r>
-        <w:rPr>
-          <w:lang w:val="it-IT" w:eastAsia="en-GB"/>
-        </w:rPr>
-        <w:t>con</w:t>
-      </w:r>
-      <w:r>
-        <w:rPr>
-          <w:color w:val="C0C0C0"/>
-          <w:lang w:val="it-IT" w:eastAsia="en-GB"/>
-        </w:rPr>
-        <w:t xml:space="preserve"> </w:t>
-      </w:r>
-      <w:r>
-        <w:rPr>
-          <w:lang w:val="it-IT" w:eastAsia="en-GB"/>
-        </w:rPr>
-        <w:t>i</w:t>
-      </w:r>
-      <w:r>
-        <w:rPr>
-          <w:color w:val="C0C0C0"/>
-          <w:lang w:val="it-IT" w:eastAsia="en-GB"/>
-        </w:rPr>
-        <w:t xml:space="preserve"> </w:t>
-      </w:r>
-      <w:r>
-        <w:rPr>
-          <w:lang w:val="it-IT" w:eastAsia="en-GB"/>
-        </w:rPr>
-        <w:t>che</w:t>
-      </w:r>
-      <w:r>
-        <w:rPr>
-          <w:color w:val="C0C0C0"/>
-          <w:lang w:val="it-IT" w:eastAsia="en-GB"/>
-        </w:rPr>
-        <w:t xml:space="preserve"> </w:t>
-      </w:r>
-      <w:r>
-        <w:rPr>
-          <w:lang w:val="it-IT" w:eastAsia="en-GB"/>
-        </w:rPr>
-        <w:t>va</w:t>
-      </w:r>
-      <w:r>
-        <w:rPr>
-          <w:color w:val="C0C0C0"/>
-          <w:lang w:val="it-IT" w:eastAsia="en-GB"/>
-        </w:rPr>
-        <w:t xml:space="preserve"> </w:t>
-      </w:r>
-      <w:r>
-        <w:rPr>
-          <w:lang w:val="it-IT" w:eastAsia="en-GB"/>
-        </w:rPr>
-        <w:t>da</w:t>
-      </w:r>
-      <w:r>
-        <w:rPr>
-          <w:color w:val="C0C0C0"/>
-          <w:lang w:val="it-IT" w:eastAsia="en-GB"/>
-        </w:rPr>
-        <w:t xml:space="preserve"> </w:t>
-      </w:r>
-      <w:r>
-        <w:rPr>
-          <w:lang w:val="it-IT" w:eastAsia="en-GB"/>
-        </w:rPr>
-        <w:t>0</w:t>
-      </w:r>
-      <w:r>
-        <w:rPr>
-          <w:color w:val="C0C0C0"/>
-          <w:lang w:val="it-IT" w:eastAsia="en-GB"/>
-        </w:rPr>
-        <w:t xml:space="preserve"> </w:t>
-      </w:r>
-      <w:r>
-        <w:rPr>
-          <w:lang w:val="it-IT" w:eastAsia="en-GB"/>
-        </w:rPr>
-        <w:t>a</w:t>
-      </w:r>
-      <w:r>
-        <w:rPr>
-          <w:color w:val="C0C0C0"/>
-          <w:lang w:val="it-IT" w:eastAsia="en-GB"/>
-        </w:rPr>
-        <w:t xml:space="preserve"> </w:t>
-      </w:r>
-      <w:r>
-        <w:rPr>
-          <w:lang w:val="it-IT" w:eastAsia="en-GB"/>
-        </w:rPr>
-        <w:t>size-1</w:t>
-      </w:r>
-      <w:r>
-        <w:rPr>
-          <w:color w:val="C0C0C0"/>
-          <w:lang w:val="it-IT" w:eastAsia="en-GB"/>
-        </w:rPr>
-        <w:t xml:space="preserve"> </w:t>
-      </w:r>
-      <w:r>
-        <w:rPr>
-          <w:lang w:val="it-IT" w:eastAsia="en-GB"/>
-        </w:rPr>
-        <w:t>si</w:t>
-      </w:r>
-      <w:r>
-        <w:rPr>
-          <w:color w:val="C0C0C0"/>
-          <w:lang w:val="it-IT" w:eastAsia="en-GB"/>
-        </w:rPr>
-        <w:t xml:space="preserve"> </w:t>
-      </w:r>
-      <w:r>
-        <w:rPr>
-          <w:lang w:val="it-IT" w:eastAsia="en-GB"/>
-        </w:rPr>
-        <w:t>fa</w:t>
-      </w:r>
-      <w:r>
-        <w:rPr>
-          <w:color w:val="C0C0C0"/>
-          <w:lang w:val="it-IT" w:eastAsia="en-GB"/>
-        </w:rPr>
-        <w:t xml:space="preserve"> </w:t>
-      </w:r>
-      <w:r>
-        <w:rPr>
-          <w:lang w:val="it-IT" w:eastAsia="en-GB"/>
-        </w:rPr>
-        <w:t>result[i]=compute(i);</w:t>
-      </w:r>
-      <w:r>
-        <w:rPr>
-          <w:color w:val="C0C0C0"/>
-          <w:lang w:val="it-IT" w:eastAsia="en-GB"/>
-        </w:rPr>
-        <w:t xml:space="preserve"> </w:t>
-      </w:r>
-      <w:r>
-        <w:rPr>
-          <w:lang w:val="it-IT" w:eastAsia="en-GB"/>
-        </w:rPr>
-        <w:t>COMPUTE FA LA FASE C</w:t>
-      </w:r>
-    </w:p>
-    <w:p>
-      <w:pPr>
-        <w:ind w:left="284" w:hanging="284"/>
-        <w:rPr>
-          <w:lang w:val="it-IT" w:eastAsia="en-GB"/>
-        </w:rPr>
-      </w:pPr>
-    </w:p>
-    <w:p>
-      <w:pPr>
-        <w:ind w:left="284" w:hanging="284"/>
-        <w:rPr>
-          <w:lang w:val="it-IT" w:eastAsia="en-GB"/>
-        </w:rPr>
-      </w:pPr>
-      <w:r>
-        <w:rPr>
-          <w:lang w:val="it-IT" w:eastAsia="en-GB"/>
-        </w:rPr>
-        <w:t>eventuali</w:t>
-      </w:r>
-      <w:r>
-        <w:rPr>
-          <w:color w:val="C0C0C0"/>
-          <w:lang w:val="it-IT" w:eastAsia="en-GB"/>
-        </w:rPr>
-        <w:t xml:space="preserve"> </w:t>
-      </w:r>
-      <w:r>
-        <w:rPr>
-          <w:lang w:val="it-IT" w:eastAsia="en-GB"/>
-        </w:rPr>
-        <w:t>messaggi</w:t>
-      </w:r>
-      <w:r>
-        <w:rPr>
-          <w:color w:val="C0C0C0"/>
-          <w:lang w:val="it-IT" w:eastAsia="en-GB"/>
-        </w:rPr>
-        <w:t xml:space="preserve"> </w:t>
-      </w:r>
-      <w:r>
-        <w:rPr>
-          <w:lang w:val="it-IT" w:eastAsia="en-GB"/>
-        </w:rPr>
-        <w:t>di</w:t>
-      </w:r>
-      <w:r>
-        <w:rPr>
-          <w:color w:val="C0C0C0"/>
-          <w:lang w:val="it-IT" w:eastAsia="en-GB"/>
-        </w:rPr>
-        <w:t xml:space="preserve"> </w:t>
-      </w:r>
-      <w:r>
-        <w:rPr>
-          <w:lang w:val="it-IT" w:eastAsia="en-GB"/>
-        </w:rPr>
-        <w:t>errore</w:t>
-      </w:r>
-      <w:r>
-        <w:rPr>
-          <w:color w:val="C0C0C0"/>
-          <w:lang w:val="it-IT" w:eastAsia="en-GB"/>
-        </w:rPr>
-        <w:t xml:space="preserve"> </w:t>
-      </w:r>
-      <w:r>
-        <w:rPr>
-          <w:lang w:val="it-IT" w:eastAsia="en-GB"/>
-        </w:rPr>
-        <w:t>si</w:t>
-      </w:r>
-      <w:r>
-        <w:rPr>
-          <w:color w:val="C0C0C0"/>
-          <w:lang w:val="it-IT" w:eastAsia="en-GB"/>
-        </w:rPr>
-        <w:t xml:space="preserve"> </w:t>
-      </w:r>
-      <w:r>
-        <w:rPr>
-          <w:lang w:val="it-IT" w:eastAsia="en-GB"/>
-        </w:rPr>
-        <w:t>trovano</w:t>
-      </w:r>
-      <w:r>
-        <w:rPr>
-          <w:color w:val="C0C0C0"/>
-          <w:lang w:val="it-IT" w:eastAsia="en-GB"/>
-        </w:rPr>
-        <w:t xml:space="preserve"> </w:t>
-      </w:r>
-      <w:r>
-        <w:rPr>
-          <w:lang w:val="it-IT" w:eastAsia="en-GB"/>
-        </w:rPr>
-        <w:t>nella</w:t>
-      </w:r>
-      <w:r>
-        <w:rPr>
-          <w:color w:val="C0C0C0"/>
-          <w:lang w:val="it-IT" w:eastAsia="en-GB"/>
-        </w:rPr>
-        <w:t xml:space="preserve"> </w:t>
-      </w:r>
-      <w:proofErr w:type="spellStart"/>
-      <w:r>
-        <w:rPr>
-          <w:lang w:val="it-IT" w:eastAsia="en-GB"/>
-        </w:rPr>
-        <w:t>QString</w:t>
-      </w:r>
-      <w:proofErr w:type="spellEnd"/>
-      <w:r>
-        <w:rPr>
-          <w:lang w:val="it-IT" w:eastAsia="en-GB"/>
-        </w:rPr>
-        <w:t>,</w:t>
-      </w:r>
-      <w:r>
-        <w:rPr>
-          <w:color w:val="C0C0C0"/>
-          <w:lang w:val="it-IT" w:eastAsia="en-GB"/>
-        </w:rPr>
-        <w:t xml:space="preserve"> </w:t>
-      </w:r>
-      <w:r>
-        <w:rPr>
-          <w:lang w:val="it-IT" w:eastAsia="en-GB"/>
-        </w:rPr>
-        <w:t>interna</w:t>
-      </w:r>
-      <w:r>
-        <w:rPr>
-          <w:color w:val="C0C0C0"/>
-          <w:lang w:val="it-IT" w:eastAsia="en-GB"/>
-        </w:rPr>
-        <w:t xml:space="preserve"> </w:t>
-      </w:r>
-      <w:r>
-        <w:rPr>
-          <w:lang w:val="it-IT" w:eastAsia="en-GB"/>
-        </w:rPr>
-        <w:t>ma</w:t>
-      </w:r>
-      <w:r>
-        <w:rPr>
-          <w:color w:val="C0C0C0"/>
-          <w:lang w:val="it-IT" w:eastAsia="en-GB"/>
-        </w:rPr>
-        <w:t xml:space="preserve"> </w:t>
-      </w:r>
-      <w:r>
-        <w:rPr>
-          <w:lang w:val="it-IT" w:eastAsia="en-GB"/>
-        </w:rPr>
-        <w:t>pubblica,</w:t>
-      </w:r>
-      <w:r>
-        <w:rPr>
-          <w:color w:val="C0C0C0"/>
-          <w:lang w:val="it-IT" w:eastAsia="en-GB"/>
-        </w:rPr>
-        <w:t xml:space="preserve"> </w:t>
-      </w:r>
-      <w:r>
-        <w:rPr>
-          <w:lang w:val="it-IT" w:eastAsia="en-GB"/>
-        </w:rPr>
-        <w:t>di</w:t>
-      </w:r>
-      <w:r>
-        <w:rPr>
-          <w:color w:val="C0C0C0"/>
-          <w:lang w:val="it-IT" w:eastAsia="en-GB"/>
-        </w:rPr>
-        <w:t xml:space="preserve"> </w:t>
-      </w:r>
-      <w:r>
-        <w:rPr>
-          <w:lang w:val="it-IT" w:eastAsia="en-GB"/>
-        </w:rPr>
-        <w:t>nome</w:t>
-      </w:r>
-      <w:r>
-        <w:rPr>
-          <w:color w:val="C0C0C0"/>
-          <w:lang w:val="it-IT" w:eastAsia="en-GB"/>
-        </w:rPr>
-        <w:t xml:space="preserve"> </w:t>
-      </w:r>
-      <w:proofErr w:type="spellStart"/>
-      <w:r>
-        <w:rPr>
-          <w:rFonts w:ascii="Courier New" w:hAnsi="Courier New" w:cs="Courier New"/>
-          <w:lang w:val="it-IT" w:eastAsia="en-GB"/>
-        </w:rPr>
         <w:t>err</w:t>
       </w:r>
-      <w:proofErr w:type="spellEnd"/>
     </w:p>
     <w:p>
       <w:pPr>
@@ -1218,53 +1088,29 @@
       <w:r>
         <w:t xml:space="preserve">Con </w:t>
       </w:r>
-      <w:proofErr w:type="spellStart"/>
       <w:r>
         <w:rPr>
           <w:rFonts w:ascii="Courier New" w:hAnsi="Courier New" w:cs="Courier New"/>
         </w:rPr>
-        <w:t>xyNaming</w:t>
-      </w:r>
-      <w:proofErr w:type="spellEnd"/>
+        <w:t>xyNaming=true</w:t>
+      </w:r>
+      <w:r>
+        <w:t xml:space="preserve"> i nomi sono speciali: del tipo </w:t>
+      </w:r>
       <w:r>
         <w:rPr>
           <w:rFonts w:ascii="Courier New" w:hAnsi="Courier New" w:cs="Courier New"/>
         </w:rPr>
-        <w:t>=</w:t>
-      </w:r>
-      <w:proofErr w:type="spellStart"/>
+        <w:t>v#</w:t>
+      </w:r>
+      <w:r>
+        <w:t xml:space="preserve"> o </w:t>
+      </w:r>
       <w:r>
         <w:rPr>
           <w:rFonts w:ascii="Courier New" w:hAnsi="Courier New" w:cs="Courier New"/>
         </w:rPr>
-        <w:t>true</w:t>
-      </w:r>
-      <w:proofErr w:type="spellEnd"/>
-      <w:r>
-        <w:t xml:space="preserve"> i nomi sono speciali: del tipo </w:t>
-      </w:r>
-      <w:r>
-        <w:rPr>
-          <w:rFonts w:ascii="Courier New" w:hAnsi="Courier New" w:cs="Courier New"/>
-        </w:rPr>
-        <w:t>v#</w:t>
-      </w:r>
-      <w:r>
-        <w:t xml:space="preserve"> o </w:t>
-      </w:r>
-      <w:proofErr w:type="spellStart"/>
-      <w:r>
-        <w:rPr>
-          <w:rFonts w:ascii="Courier New" w:hAnsi="Courier New" w:cs="Courier New"/>
-        </w:rPr>
-        <w:t>f#v</w:t>
-      </w:r>
-      <w:proofErr w:type="spellEnd"/>
-      <w:r>
-        <w:rPr>
-          <w:rFonts w:ascii="Courier New" w:hAnsi="Courier New" w:cs="Courier New"/>
-        </w:rPr>
-        <w:t>#</w:t>
+        <w:t>f#v#</w:t>
       </w:r>
       <w:r>
         <w:t xml:space="preserve">. </w:t>
@@ -1304,34 +1150,24 @@
           <w:lang w:val="it-IT" w:eastAsia="en-GB"/>
         </w:rPr>
       </w:pPr>
-      <w:proofErr w:type="spellStart"/>
       <w:r>
         <w:rPr>
           <w:lang w:val="it-IT" w:eastAsia="en-GB"/>
         </w:rPr>
         <w:t>FunPlot</w:t>
       </w:r>
-      <w:proofErr w:type="spellEnd"/>
-    </w:p>
-    <w:p>
-      <w:pPr>
-        <w:rPr>
-          <w:lang w:val="it-IT" w:eastAsia="en-GB"/>
-        </w:rPr>
-      </w:pPr>
-      <w:proofErr w:type="spellStart"/>
-      <w:r>
-        <w:rPr>
-          <w:lang w:val="it-IT" w:eastAsia="en-GB"/>
-        </w:rPr>
-        <w:t>FunPlot</w:t>
-      </w:r>
-      <w:proofErr w:type="spellEnd"/>
-      <w:r>
-        <w:rPr>
-          <w:lang w:val="it-IT" w:eastAsia="en-GB"/>
-        </w:rPr>
-        <w:t xml:space="preserve"> usa le seguenti righe</w:t>
+    </w:p>
+    <w:p>
+      <w:pPr>
+        <w:rPr>
+          <w:lang w:val="it-IT" w:eastAsia="en-GB"/>
+        </w:rPr>
+      </w:pPr>
+      <w:r>
+        <w:rPr>
+          <w:lang w:val="it-IT" w:eastAsia="en-GB"/>
+        </w:rPr>
+        <w:t>FunPlot usa le seguenti righe</w:t>
       </w:r>
       <w:r>
         <w:rPr>
@@ -1414,7 +1250,6 @@
         </w:rPr>
         <w:t xml:space="preserve">   </w:t>
       </w:r>
-      <w:proofErr w:type="spellStart"/>
       <w:r>
         <w:rPr>
           <w:rFonts w:ascii="Courier New" w:eastAsia="Times New Roman" w:hAnsi="Courier New" w:cs="Courier New"/>
@@ -1444,7 +1279,6 @@
         </w:rPr>
         <w:t>xyNaming</w:t>
       </w:r>
-      <w:proofErr w:type="spellEnd"/>
       <w:r>
         <w:rPr>
           <w:rFonts w:ascii="Courier New" w:eastAsia="Times New Roman" w:hAnsi="Courier New" w:cs="Courier New"/>
@@ -1531,7 +1365,6 @@
         </w:rPr>
         <w:t>=</w:t>
       </w:r>
-      <w:proofErr w:type="spellStart"/>
       <w:r>
         <w:rPr>
           <w:rFonts w:ascii="Courier New" w:eastAsia="Times New Roman" w:hAnsi="Courier New" w:cs="Courier New"/>
@@ -1561,7 +1394,6 @@
         </w:rPr>
         <w:t>getLine</w:t>
       </w:r>
-      <w:proofErr w:type="spellEnd"/>
       <w:r>
         <w:rPr>
           <w:rFonts w:ascii="Courier New" w:eastAsia="Times New Roman" w:hAnsi="Courier New" w:cs="Courier New"/>
@@ -1667,7 +1499,6 @@
         </w:rPr>
         <w:t>=</w:t>
       </w:r>
-      <w:proofErr w:type="spellStart"/>
       <w:r>
         <w:rPr>
           <w:rFonts w:ascii="Courier New" w:eastAsia="Times New Roman" w:hAnsi="Courier New" w:cs="Courier New"/>
@@ -1697,7 +1528,6 @@
         </w:rPr>
         <w:t>getNamesAndMatrix</w:t>
       </w:r>
-      <w:proofErr w:type="spellEnd"/>
       <w:r>
         <w:rPr>
           <w:rFonts w:ascii="Courier New" w:eastAsia="Times New Roman" w:hAnsi="Courier New" w:cs="Courier New"/>
@@ -1707,7 +1537,6 @@
         </w:rPr>
         <w:t>(</w:t>
       </w:r>
-      <w:proofErr w:type="spellStart"/>
       <w:proofErr w:type="gramStart"/>
       <w:r>
         <w:rPr>
@@ -1738,7 +1567,6 @@
         </w:rPr>
         <w:t>xMatr</w:t>
       </w:r>
-      <w:proofErr w:type="spellEnd"/>
       <w:proofErr w:type="gramEnd"/>
       <w:r>
         <w:rPr>
@@ -1761,7 +1589,19 @@
           <w:lang w:val="it-IT" w:eastAsia="en-GB"/>
         </w:rPr>
         <w:lastRenderedPageBreak/>
-        <w:t>e ripetitivamente per I vari punti:</w:t>
+        <w:t xml:space="preserve">e ripetitivamente per </w:t>
+      </w:r>
+      <w:r>
+        <w:rPr>
+          <w:lang w:val="it-IT" w:eastAsia="en-GB"/>
+        </w:rPr>
+        <w:t>i</w:t>
+      </w:r>
+      <w:r>
+        <w:rPr>
+          <w:lang w:val="it-IT" w:eastAsia="en-GB"/>
+        </w:rPr>
+        <w:t xml:space="preserve"> vari punti:</w:t>
       </w:r>
     </w:p>
     <w:p>
@@ -1802,7 +1642,6 @@
         </w:rPr>
         <w:t xml:space="preserve">   </w:t>
       </w:r>
-      <w:proofErr w:type="spellStart"/>
       <w:r>
         <w:rPr>
           <w:rFonts w:ascii="Courier New" w:eastAsia="Times New Roman" w:hAnsi="Courier New" w:cs="Courier New"/>
@@ -1813,7 +1652,6 @@
         </w:rPr>
         <w:t>yRes</w:t>
       </w:r>
-      <w:proofErr w:type="spellEnd"/>
       <w:r>
         <w:rPr>
           <w:rFonts w:ascii="Courier New" w:eastAsia="Times New Roman" w:hAnsi="Courier New" w:cs="Courier New"/>
@@ -1862,7 +1700,6 @@
         </w:rPr>
         <w:t>]=</w:t>
       </w:r>
-      <w:proofErr w:type="spellStart"/>
       <w:r>
         <w:rPr>
           <w:rFonts w:ascii="Courier New" w:eastAsia="Times New Roman" w:hAnsi="Courier New" w:cs="Courier New"/>
@@ -1892,7 +1729,6 @@
         </w:rPr>
         <w:t>compute</w:t>
       </w:r>
-      <w:proofErr w:type="spellEnd"/>
       <w:proofErr w:type="gramEnd"/>
       <w:r>
         <w:rPr>
@@ -1951,8 +1787,6 @@
           <w:lang w:val="it-IT" w:eastAsia="it-IT"/>
         </w:rPr>
       </w:pPr>
-      <w:bookmarkStart w:id="0" w:name="_GoBack"/>
-      <w:bookmarkEnd w:id="0"/>
     </w:p>
     <w:p>
       <w:pPr>
@@ -1961,48 +1795,24 @@
           <w:lang w:val="it-IT" w:eastAsia="en-GB"/>
         </w:rPr>
       </w:pPr>
-      <w:proofErr w:type="spellStart"/>
-      <w:r>
-        <w:rPr>
-          <w:lang w:val="it-IT" w:eastAsia="en-GB"/>
-        </w:rPr>
-        <w:t>CDataSelWin</w:t>
-      </w:r>
-      <w:proofErr w:type="spellEnd"/>
-      <w:r>
-        <w:rPr>
-          <w:lang w:val="it-IT" w:eastAsia="en-GB"/>
-        </w:rPr>
-        <w:t xml:space="preserve"> in </w:t>
-      </w:r>
-      <w:proofErr w:type="spellStart"/>
-      <w:r>
-        <w:rPr>
-          <w:lang w:val="it-IT" w:eastAsia="en-GB"/>
-        </w:rPr>
-        <w:t>PlotXY</w:t>
-      </w:r>
-      <w:proofErr w:type="spellEnd"/>
-    </w:p>
-    <w:p>
-      <w:pPr>
-        <w:rPr>
-          <w:lang w:val="it-IT" w:eastAsia="en-GB"/>
-        </w:rPr>
-      </w:pPr>
-      <w:proofErr w:type="spellStart"/>
-      <w:r>
-        <w:rPr>
-          <w:lang w:val="it-IT" w:eastAsia="en-GB"/>
-        </w:rPr>
-        <w:t>CDataSelWin</w:t>
-      </w:r>
-      <w:proofErr w:type="spellEnd"/>
-      <w:r>
-        <w:rPr>
-          <w:lang w:val="it-IT" w:eastAsia="en-GB"/>
-        </w:rPr>
-        <w:t xml:space="preserve"> </w:t>
+      <w:r>
+        <w:rPr>
+          <w:lang w:val="it-IT" w:eastAsia="en-GB"/>
+        </w:rPr>
+        <w:t>CDataSelWin in PlotXY</w:t>
+      </w:r>
+    </w:p>
+    <w:p>
+      <w:pPr>
+        <w:rPr>
+          <w:lang w:val="it-IT" w:eastAsia="en-GB"/>
+        </w:rPr>
+      </w:pPr>
+      <w:r>
+        <w:rPr>
+          <w:lang w:val="it-IT" w:eastAsia="en-GB"/>
+        </w:rPr>
+        <w:t xml:space="preserve">CDataSelWin </w:t>
       </w:r>
       <w:r>
         <w:rPr>
@@ -2079,7 +1889,6 @@
         </w:rPr>
         <w:t xml:space="preserve">    </w:t>
       </w:r>
-      <w:proofErr w:type="spellStart"/>
       <w:r>
         <w:rPr>
           <w:rFonts w:ascii="Courier New" w:eastAsia="Times New Roman" w:hAnsi="Courier New" w:cs="Courier New"/>
@@ -2109,7 +1918,6 @@
         </w:rPr>
         <w:t>getFileInfo</w:t>
       </w:r>
-      <w:proofErr w:type="spellEnd"/>
       <w:r>
         <w:rPr>
           <w:rFonts w:ascii="Courier New" w:eastAsia="Times New Roman" w:hAnsi="Courier New" w:cs="Courier New"/>
@@ -2119,7 +1927,6 @@
         </w:rPr>
         <w:t>(</w:t>
       </w:r>
-      <w:proofErr w:type="spellStart"/>
       <w:r>
         <w:rPr>
           <w:rFonts w:ascii="Courier New" w:eastAsia="Times New Roman" w:hAnsi="Courier New" w:cs="Courier New"/>
@@ -2130,7 +1937,6 @@
         </w:rPr>
         <w:t>fileNumsLst</w:t>
       </w:r>
-      <w:proofErr w:type="spellEnd"/>
       <w:r>
         <w:rPr>
           <w:rFonts w:ascii="Courier New" w:eastAsia="Times New Roman" w:hAnsi="Courier New" w:cs="Courier New"/>
@@ -2150,7 +1956,6 @@
         </w:rPr>
         <w:t xml:space="preserve"> </w:t>
       </w:r>
-      <w:proofErr w:type="spellStart"/>
       <w:r>
         <w:rPr>
           <w:rFonts w:ascii="Courier New" w:eastAsia="Times New Roman" w:hAnsi="Courier New" w:cs="Courier New"/>
@@ -2161,7 +1966,6 @@
         </w:rPr>
         <w:t>fileNamesLst</w:t>
       </w:r>
-      <w:proofErr w:type="spellEnd"/>
       <w:r>
         <w:rPr>
           <w:rFonts w:ascii="Courier New" w:eastAsia="Times New Roman" w:hAnsi="Courier New" w:cs="Courier New"/>
@@ -2181,7 +1985,6 @@
         </w:rPr>
         <w:t xml:space="preserve"> </w:t>
       </w:r>
-      <w:proofErr w:type="spellStart"/>
       <w:r>
         <w:rPr>
           <w:rFonts w:ascii="Courier New" w:eastAsia="Times New Roman" w:hAnsi="Courier New" w:cs="Courier New"/>
@@ -2192,7 +1995,6 @@
         </w:rPr>
         <w:t>varMaxNumsLst</w:t>
       </w:r>
-      <w:proofErr w:type="spellEnd"/>
       <w:r>
         <w:rPr>
           <w:rFonts w:ascii="Courier New" w:eastAsia="Times New Roman" w:hAnsi="Courier New" w:cs="Courier New"/>
@@ -2260,7 +2062,6 @@
         </w:rPr>
         <w:t>=</w:t>
       </w:r>
-      <w:proofErr w:type="spellStart"/>
       <w:r>
         <w:rPr>
           <w:rFonts w:ascii="Courier New" w:eastAsia="Times New Roman" w:hAnsi="Courier New" w:cs="Courier New"/>
@@ -2290,7 +2091,6 @@
         </w:rPr>
         <w:t>getLine</w:t>
       </w:r>
-      <w:proofErr w:type="spellEnd"/>
       <w:r>
         <w:rPr>
           <w:rFonts w:ascii="Courier New" w:eastAsia="Times New Roman" w:hAnsi="Courier New" w:cs="Courier New"/>
@@ -2474,7 +2274,6 @@
         </w:rPr>
         <w:t>=</w:t>
       </w:r>
-      <w:proofErr w:type="spellStart"/>
       <w:r>
         <w:rPr>
           <w:rFonts w:ascii="Courier New" w:eastAsia="Times New Roman" w:hAnsi="Courier New" w:cs="Courier New"/>
@@ -2504,7 +2303,6 @@
         </w:rPr>
         <w:t>getNamesAndMatrix</w:t>
       </w:r>
-      <w:proofErr w:type="spellEnd"/>
       <w:r>
         <w:rPr>
           <w:rFonts w:ascii="Courier New" w:eastAsia="Times New Roman" w:hAnsi="Courier New" w:cs="Courier New"/>
@@ -2514,7 +2312,6 @@
         </w:rPr>
         <w:t>(</w:t>
       </w:r>
-      <w:proofErr w:type="spellStart"/>
       <w:r>
         <w:rPr>
           <w:rFonts w:ascii="Courier New" w:eastAsia="Times New Roman" w:hAnsi="Courier New" w:cs="Courier New"/>
@@ -2544,7 +2341,6 @@
         </w:rPr>
         <w:t>varNames</w:t>
       </w:r>
-      <w:proofErr w:type="spellEnd"/>
       <w:r>
         <w:rPr>
           <w:rFonts w:ascii="Courier New" w:eastAsia="Times New Roman" w:hAnsi="Courier New" w:cs="Courier New"/>
@@ -2564,7 +2360,6 @@
         </w:rPr>
         <w:t xml:space="preserve"> </w:t>
       </w:r>
-      <w:proofErr w:type="spellStart"/>
       <w:r>
         <w:rPr>
           <w:rFonts w:ascii="Courier New" w:eastAsia="Times New Roman" w:hAnsi="Courier New" w:cs="Courier New"/>
@@ -2575,7 +2370,6 @@
         </w:rPr>
         <w:t>varMatrix</w:t>
       </w:r>
-      <w:proofErr w:type="spellEnd"/>
       <w:r>
         <w:rPr>
           <w:rFonts w:ascii="Courier New" w:eastAsia="Times New Roman" w:hAnsi="Courier New" w:cs="Courier New"/>
@@ -2595,7 +2389,6 @@
         </w:rPr>
         <w:t xml:space="preserve"> </w:t>
       </w:r>
-      <w:proofErr w:type="spellStart"/>
       <w:r>
         <w:rPr>
           <w:rFonts w:ascii="Courier New" w:eastAsia="Times New Roman" w:hAnsi="Courier New" w:cs="Courier New"/>
@@ -2606,7 +2399,6 @@
         </w:rPr>
         <w:t>namesFullList</w:t>
       </w:r>
-      <w:proofErr w:type="spellEnd"/>
       <w:r>
         <w:rPr>
           <w:rFonts w:ascii="Courier New" w:eastAsia="Times New Roman" w:hAnsi="Courier New" w:cs="Courier New"/>
@@ -2834,36 +2626,19 @@
           <w:lang w:val="it-IT" w:eastAsia="en-GB"/>
         </w:rPr>
       </w:pPr>
-      <w:proofErr w:type="spellStart"/>
-      <w:r>
-        <w:rPr>
-          <w:lang w:val="it-IT" w:eastAsia="en-GB"/>
-        </w:rPr>
-        <w:t>CVarTable</w:t>
-      </w:r>
-      <w:proofErr w:type="spellEnd"/>
-      <w:r>
-        <w:rPr>
-          <w:lang w:val="it-IT" w:eastAsia="en-GB"/>
-        </w:rPr>
-        <w:t xml:space="preserve"> in </w:t>
-      </w:r>
-      <w:proofErr w:type="spellStart"/>
-      <w:r>
-        <w:rPr>
-          <w:lang w:val="it-IT" w:eastAsia="en-GB"/>
-        </w:rPr>
-        <w:t>PlotXY</w:t>
-      </w:r>
-      <w:proofErr w:type="spellEnd"/>
-    </w:p>
-    <w:p>
-      <w:pPr>
-        <w:rPr>
-          <w:lang w:val="it-IT" w:eastAsia="en-GB"/>
-        </w:rPr>
-      </w:pPr>
-      <w:proofErr w:type="spellStart"/>
+      <w:r>
+        <w:rPr>
+          <w:lang w:val="it-IT" w:eastAsia="en-GB"/>
+        </w:rPr>
+        <w:t>CVarTable in PlotXY</w:t>
+      </w:r>
+    </w:p>
+    <w:p>
+      <w:pPr>
+        <w:rPr>
+          <w:lang w:val="it-IT" w:eastAsia="en-GB"/>
+        </w:rPr>
+      </w:pPr>
       <w:r>
         <w:rPr>
           <w:lang w:val="it-IT" w:eastAsia="en-GB"/>
@@ -2874,14 +2649,7 @@
         <w:rPr>
           <w:lang w:val="it-IT" w:eastAsia="en-GB"/>
         </w:rPr>
-        <w:t>arTable</w:t>
-      </w:r>
-      <w:proofErr w:type="spellEnd"/>
-      <w:r>
-        <w:rPr>
-          <w:lang w:val="it-IT" w:eastAsia="en-GB"/>
-        </w:rPr>
-        <w:t xml:space="preserve"> usa </w:t>
+        <w:t xml:space="preserve">arTable usa </w:t>
       </w:r>
       <w:r>
         <w:rPr>
@@ -2935,7 +2703,6 @@
         </w:rPr>
         <w:t xml:space="preserve">    </w:t>
       </w:r>
-      <w:proofErr w:type="spellStart"/>
       <w:r>
         <w:rPr>
           <w:rFonts w:ascii="Courier New" w:eastAsia="Times New Roman" w:hAnsi="Courier New" w:cs="Courier New"/>
@@ -2965,7 +2732,6 @@
         </w:rPr>
         <w:t>getFileInfo</w:t>
       </w:r>
-      <w:proofErr w:type="spellEnd"/>
       <w:r>
         <w:rPr>
           <w:rFonts w:ascii="Courier New" w:eastAsia="Times New Roman" w:hAnsi="Courier New" w:cs="Courier New"/>
@@ -2975,7 +2741,6 @@
         </w:rPr>
         <w:t>(</w:t>
       </w:r>
-      <w:proofErr w:type="spellStart"/>
       <w:r>
         <w:rPr>
           <w:rFonts w:ascii="Courier New" w:eastAsia="Times New Roman" w:hAnsi="Courier New" w:cs="Courier New"/>
@@ -2986,7 +2751,6 @@
         </w:rPr>
         <w:t>allFileNums</w:t>
       </w:r>
-      <w:proofErr w:type="spellEnd"/>
       <w:r>
         <w:rPr>
           <w:rFonts w:ascii="Courier New" w:eastAsia="Times New Roman" w:hAnsi="Courier New" w:cs="Courier New"/>
@@ -3006,7 +2770,6 @@
         </w:rPr>
         <w:t xml:space="preserve"> </w:t>
       </w:r>
-      <w:proofErr w:type="spellStart"/>
       <w:r>
         <w:rPr>
           <w:rFonts w:ascii="Courier New" w:eastAsia="Times New Roman" w:hAnsi="Courier New" w:cs="Courier New"/>
@@ -3017,7 +2780,6 @@
         </w:rPr>
         <w:t>allFileNames</w:t>
       </w:r>
-      <w:proofErr w:type="spellEnd"/>
       <w:r>
         <w:rPr>
           <w:rFonts w:ascii="Courier New" w:eastAsia="Times New Roman" w:hAnsi="Courier New" w:cs="Courier New"/>
@@ -3037,7 +2799,6 @@
         </w:rPr>
         <w:t xml:space="preserve"> </w:t>
       </w:r>
-      <w:proofErr w:type="spellStart"/>
       <w:r>
         <w:rPr>
           <w:rFonts w:ascii="Courier New" w:eastAsia="Times New Roman" w:hAnsi="Courier New" w:cs="Courier New"/>
@@ -3048,7 +2809,6 @@
         </w:rPr>
         <w:t>varMaxNumsLst</w:t>
       </w:r>
-      <w:proofErr w:type="spellEnd"/>
       <w:r>
         <w:rPr>
           <w:rFonts w:ascii="Courier New" w:eastAsia="Times New Roman" w:hAnsi="Courier New" w:cs="Courier New"/>
@@ -3097,7 +2857,6 @@
         </w:rPr>
         <w:t xml:space="preserve">    </w:t>
       </w:r>
-      <w:proofErr w:type="spellStart"/>
       <w:r>
         <w:rPr>
           <w:rFonts w:ascii="Courier New" w:eastAsia="Times New Roman" w:hAnsi="Courier New" w:cs="Courier New"/>
@@ -3127,7 +2886,6 @@
         </w:rPr>
         <w:t>getLine</w:t>
       </w:r>
-      <w:proofErr w:type="spellEnd"/>
       <w:r>
         <w:rPr>
           <w:rFonts w:ascii="Courier New" w:eastAsia="Times New Roman" w:hAnsi="Courier New" w:cs="Courier New"/>
@@ -3156,7 +2914,6 @@
         </w:rPr>
         <w:t>(</w:t>
       </w:r>
-      <w:proofErr w:type="spellStart"/>
       <w:proofErr w:type="gramStart"/>
       <w:r>
         <w:rPr>
@@ -3187,7 +2944,6 @@
         </w:rPr>
         <w:t>VARCOL</w:t>
       </w:r>
-      <w:proofErr w:type="spellEnd"/>
       <w:proofErr w:type="gramEnd"/>
       <w:r>
         <w:rPr>
@@ -3294,7 +3050,6 @@
         </w:rPr>
         <w:t xml:space="preserve">    </w:t>
       </w:r>
-      <w:proofErr w:type="spellStart"/>
       <w:r>
         <w:rPr>
           <w:rFonts w:ascii="Courier New" w:eastAsia="Times New Roman" w:hAnsi="Courier New" w:cs="Courier New"/>
@@ -3305,7 +3060,6 @@
         </w:rPr>
         <w:t>calcData</w:t>
       </w:r>
-      <w:proofErr w:type="spellEnd"/>
       <w:r>
         <w:rPr>
           <w:rFonts w:ascii="Courier New" w:eastAsia="Times New Roman" w:hAnsi="Courier New" w:cs="Courier New"/>
@@ -3315,7 +3069,6 @@
         </w:rPr>
         <w:t>=</w:t>
       </w:r>
-      <w:proofErr w:type="spellStart"/>
       <w:r>
         <w:rPr>
           <w:rFonts w:ascii="Courier New" w:eastAsia="Times New Roman" w:hAnsi="Courier New" w:cs="Courier New"/>
@@ -3345,7 +3098,6 @@
         </w:rPr>
         <w:t>checkAndFindNames</w:t>
       </w:r>
-      <w:proofErr w:type="spellEnd"/>
       <w:r>
         <w:rPr>
           <w:rFonts w:ascii="Courier New" w:eastAsia="Times New Roman" w:hAnsi="Courier New" w:cs="Courier New"/>
@@ -3413,7 +3165,6 @@
         </w:rPr>
         <w:t>=</w:t>
       </w:r>
-      <w:proofErr w:type="spellStart"/>
       <w:r>
         <w:rPr>
           <w:rFonts w:ascii="Courier New" w:eastAsia="Times New Roman" w:hAnsi="Courier New" w:cs="Courier New"/>
@@ -3443,7 +3194,6 @@
         </w:rPr>
         <w:t>getNamesAndMatrix</w:t>
       </w:r>
-      <w:proofErr w:type="spellEnd"/>
       <w:r>
         <w:rPr>
           <w:rFonts w:ascii="Courier New" w:eastAsia="Times New Roman" w:hAnsi="Courier New" w:cs="Courier New"/>
@@ -3453,7 +3203,6 @@
         </w:rPr>
         <w:t>(</w:t>
       </w:r>
-      <w:proofErr w:type="spellStart"/>
       <w:proofErr w:type="gramStart"/>
       <w:r>
         <w:rPr>
@@ -3503,7 +3252,6 @@
         </w:rPr>
         <w:t>yLine</w:t>
       </w:r>
-      <w:proofErr w:type="spellEnd"/>
       <w:proofErr w:type="gramEnd"/>
       <w:r>
         <w:rPr>
@@ -3546,7 +3294,6 @@
           <w:lang w:val="it-IT" w:eastAsia="en-GB"/>
         </w:rPr>
       </w:pPr>
-      <w:proofErr w:type="spellStart"/>
       <w:r>
         <w:rPr>
           <w:b/>
@@ -3554,40 +3301,11 @@
         </w:rPr>
         <w:t>getfileInfo</w:t>
       </w:r>
-      <w:proofErr w:type="spellEnd"/>
-      <w:r>
-        <w:rPr>
-          <w:lang w:val="it-IT" w:eastAsia="en-GB"/>
-        </w:rPr>
-        <w:t xml:space="preserve"> passa a </w:t>
-      </w:r>
-      <w:proofErr w:type="spellStart"/>
-      <w:r>
-        <w:rPr>
-          <w:lang w:val="it-IT" w:eastAsia="en-GB"/>
-        </w:rPr>
-        <w:t>CLineCalc</w:t>
-      </w:r>
-      <w:proofErr w:type="spellEnd"/>
-      <w:r>
-        <w:rPr>
-          <w:lang w:val="it-IT" w:eastAsia="en-GB"/>
-        </w:rPr>
-        <w:t xml:space="preserve"> i dati necessari per interpretare correttamente i nomi </w:t>
-      </w:r>
-      <w:proofErr w:type="spellStart"/>
-      <w:r>
-        <w:rPr>
-          <w:lang w:val="it-IT" w:eastAsia="en-GB"/>
-        </w:rPr>
-        <w:t>f#v</w:t>
-      </w:r>
-      <w:proofErr w:type="spellEnd"/>
-      <w:r>
-        <w:rPr>
-          <w:lang w:val="it-IT" w:eastAsia="en-GB"/>
-        </w:rPr>
-        <w:t># e la relativa associazione agli array numerici</w:t>
+      <w:r>
+        <w:rPr>
+          <w:lang w:val="it-IT" w:eastAsia="en-GB"/>
+        </w:rPr>
+        <w:t xml:space="preserve"> passa a CLineCalc i dati necessari per interpretare correttamente i nomi f#v# e la relativa associazione agli array numerici</w:t>
       </w:r>
     </w:p>
     <w:p>
@@ -3601,7 +3319,6 @@
           <w:lang w:val="it-IT" w:eastAsia="en-GB"/>
         </w:rPr>
       </w:pPr>
-      <w:proofErr w:type="spellStart"/>
       <w:r>
         <w:rPr>
           <w:b/>
@@ -3609,21 +3326,12 @@
         </w:rPr>
         <w:t>checkAndFindNames</w:t>
       </w:r>
-      <w:proofErr w:type="spellEnd"/>
-      <w:r>
-        <w:rPr>
-          <w:lang w:val="it-IT" w:eastAsia="en-GB"/>
-        </w:rPr>
-        <w:t xml:space="preserve"> fa verifica sintattica e compila </w:t>
-      </w:r>
-      <w:proofErr w:type="spellStart"/>
-      <w:r>
-        <w:rPr>
-          <w:lang w:val="it-IT" w:eastAsia="en-GB"/>
-        </w:rPr>
-        <w:t>nameData</w:t>
-      </w:r>
-      <w:proofErr w:type="spellEnd"/>
+      <w:r>
+        <w:rPr>
+          <w:lang w:val="it-IT" w:eastAsia="en-GB"/>
+        </w:rPr>
+        <w:t xml:space="preserve"> fa verifica sintattica e compila nameData</w:t>
+      </w:r>
     </w:p>
     <w:p>
       <w:pPr>
@@ -3636,7 +3344,6 @@
           <w:lang w:val="it-IT" w:eastAsia="en-GB"/>
         </w:rPr>
       </w:pPr>
-      <w:proofErr w:type="spellStart"/>
       <w:r>
         <w:rPr>
           <w:b/>
@@ -3644,12 +3351,11 @@
         </w:rPr>
         <w:t>getNamesAndMatrix</w:t>
       </w:r>
-      <w:proofErr w:type="spellEnd"/>
-      <w:r>
-        <w:rPr>
-          <w:lang w:val="it-IT" w:eastAsia="en-GB"/>
-        </w:rPr>
-        <w:t xml:space="preserve"> fa parecchie cose che sono state spostate,</w:t>
+      <w:r>
+        <w:rPr>
+          <w:lang w:val="it-IT" w:eastAsia="en-GB"/>
+        </w:rPr>
+        <w:t xml:space="preserve"> fa parecchie cose </w:t>
       </w:r>
     </w:p>
     <w:p>
@@ -3671,322 +3377,187 @@
         </w:rPr>
         <w:t xml:space="preserve">Inoltre quando serve usa anche </w:t>
       </w:r>
-      <w:proofErr w:type="spellStart"/>
       <w:proofErr w:type="gramStart"/>
       <w:r>
         <w:rPr>
           <w:b/>
           <w:lang w:val="it-IT" w:eastAsia="en-GB"/>
         </w:rPr>
-        <w:t>fillNames</w:t>
-      </w:r>
-      <w:proofErr w:type="spellEnd"/>
+        <w:t>fillNames(</w:t>
+      </w:r>
+      <w:proofErr w:type="gramEnd"/>
       <w:r>
         <w:rPr>
           <w:b/>
           <w:lang w:val="it-IT" w:eastAsia="en-GB"/>
         </w:rPr>
-        <w:t>(</w:t>
+        <w:t>)</w:t>
+      </w:r>
+      <w:r>
+        <w:rPr>
+          <w:b/>
+          <w:lang w:val="it-IT" w:eastAsia="en-GB"/>
+        </w:rPr>
+        <w:t xml:space="preserve"> e computeUnits()</w:t>
+      </w:r>
+    </w:p>
+    <w:p>
+      <w:pPr>
+        <w:rPr>
+          <w:lang w:val="it-IT" w:eastAsia="en-GB"/>
+        </w:rPr>
+      </w:pPr>
+    </w:p>
+    <w:p>
+      <w:pPr>
+        <w:rPr>
+          <w:lang w:val="it-IT" w:eastAsia="en-GB"/>
+        </w:rPr>
+      </w:pPr>
+    </w:p>
+    <w:p>
+      <w:pPr>
+        <w:pStyle w:val="Titolo2"/>
+        <w:rPr>
+          <w:lang w:val="it-IT" w:eastAsia="en-GB"/>
+        </w:rPr>
+      </w:pPr>
+      <w:r>
+        <w:rPr>
+          <w:lang w:val="it-IT" w:eastAsia="en-GB"/>
+        </w:rPr>
+        <w:t>Uso dell’integrale</w:t>
+      </w:r>
+    </w:p>
+    <w:p>
+      <w:pPr>
+        <w:rPr>
+          <w:lang w:val="it-IT" w:eastAsia="en-GB"/>
+        </w:rPr>
+      </w:pPr>
+    </w:p>
+    <w:p>
+      <w:pPr>
+        <w:rPr>
+          <w:lang w:val="it-IT" w:eastAsia="en-GB"/>
+        </w:rPr>
+      </w:pPr>
+      <w:r>
+        <w:rPr>
+          <w:lang w:val="it-IT" w:eastAsia="en-GB"/>
+        </w:rPr>
+        <w:t>CLineCalc di funPlot non ha il calcolo dell’integrale, il cui codice va q</w:t>
+      </w:r>
+      <w:r>
+        <w:rPr>
+          <w:lang w:val="it-IT" w:eastAsia="en-GB"/>
+        </w:rPr>
+        <w:t>u</w:t>
+      </w:r>
+      <w:r>
+        <w:rPr>
+          <w:lang w:val="it-IT" w:eastAsia="en-GB"/>
+        </w:rPr>
+        <w:t>indi estrapolato da analogo codice di CLineCalc di PlotXY</w:t>
+      </w:r>
+    </w:p>
+    <w:p>
+      <w:pPr>
+        <w:rPr>
+          <w:lang w:val="it-IT" w:eastAsia="en-GB"/>
+        </w:rPr>
+      </w:pPr>
+    </w:p>
+    <w:p>
+      <w:pPr>
+        <w:rPr>
+          <w:lang w:val="it-IT" w:eastAsia="en-GB"/>
+        </w:rPr>
+      </w:pPr>
+    </w:p>
+    <w:p>
+      <w:pPr>
+        <w:pStyle w:val="Titolo2"/>
+        <w:rPr>
+          <w:lang w:val="it-IT" w:eastAsia="en-GB"/>
+        </w:rPr>
+      </w:pPr>
+      <w:r>
+        <w:rPr>
+          <w:lang w:val="it-IT" w:eastAsia="en-GB"/>
+        </w:rPr>
+        <w:t>Uso delle unità di misura</w:t>
+      </w:r>
+    </w:p>
+    <w:p>
+      <w:pPr>
+        <w:rPr>
+          <w:lang w:val="it-IT" w:eastAsia="en-GB"/>
+        </w:rPr>
+      </w:pPr>
+      <w:r>
+        <w:rPr>
+          <w:lang w:val="it-IT" w:eastAsia="en-GB"/>
+        </w:rPr>
+        <w:t xml:space="preserve">CLineCalc di funPlot non ha il calcolo </w:t>
+      </w:r>
+      <w:r>
+        <w:rPr>
+          <w:lang w:val="it-IT" w:eastAsia="en-GB"/>
+        </w:rPr>
+        <w:t>delle unità di misura</w:t>
+      </w:r>
+      <w:r>
+        <w:rPr>
+          <w:lang w:val="it-IT" w:eastAsia="en-GB"/>
+        </w:rPr>
+        <w:t>, il cui codice va q</w:t>
+      </w:r>
+      <w:r>
+        <w:rPr>
+          <w:lang w:val="it-IT" w:eastAsia="en-GB"/>
+        </w:rPr>
+        <w:t>u</w:t>
+      </w:r>
+      <w:r>
+        <w:rPr>
+          <w:lang w:val="it-IT" w:eastAsia="en-GB"/>
+        </w:rPr>
+        <w:t>indi estrapolato da analogo codice di CLineCalc di PlotXY</w:t>
+      </w:r>
+    </w:p>
+    <w:p>
+      <w:pPr>
+        <w:rPr>
+          <w:lang w:val="it-IT" w:eastAsia="en-GB"/>
+        </w:rPr>
+      </w:pPr>
+    </w:p>
+    <w:p>
+      <w:pPr>
+        <w:rPr>
+          <w:lang w:val="it-IT" w:eastAsia="en-GB"/>
+        </w:rPr>
+      </w:pPr>
+      <w:r>
+        <w:rPr>
+          <w:lang w:val="it-IT" w:eastAsia="en-GB"/>
+        </w:rPr>
+        <w:t xml:space="preserve">C’è la funzione </w:t>
+      </w:r>
+      <w:proofErr w:type="gramStart"/>
+      <w:r>
+        <w:rPr>
+          <w:lang w:val="it-IT" w:eastAsia="en-GB"/>
+        </w:rPr>
+        <w:t>computeUnits(</w:t>
       </w:r>
       <w:proofErr w:type="gramEnd"/>
       <w:r>
         <w:rPr>
-          <w:b/>
-          <w:lang w:val="it-IT" w:eastAsia="en-GB"/>
-        </w:rPr>
-        <w:t>)</w:t>
-      </w:r>
-      <w:r>
-        <w:rPr>
-          <w:b/>
-          <w:lang w:val="it-IT" w:eastAsia="en-GB"/>
-        </w:rPr>
-        <w:t xml:space="preserve"> e </w:t>
-      </w:r>
-      <w:proofErr w:type="spellStart"/>
-      <w:r>
-        <w:rPr>
-          <w:b/>
-          <w:lang w:val="it-IT" w:eastAsia="en-GB"/>
-        </w:rPr>
-        <w:t>computeUnits</w:t>
-      </w:r>
-      <w:proofErr w:type="spellEnd"/>
-      <w:r>
-        <w:rPr>
-          <w:b/>
-          <w:lang w:val="it-IT" w:eastAsia="en-GB"/>
-        </w:rPr>
-        <w:t>()</w:t>
-      </w:r>
-    </w:p>
-    <w:p>
-      <w:pPr>
-        <w:rPr>
-          <w:lang w:val="it-IT" w:eastAsia="en-GB"/>
-        </w:rPr>
-      </w:pPr>
-    </w:p>
-    <w:p>
-      <w:pPr>
-        <w:rPr>
-          <w:lang w:val="it-IT" w:eastAsia="en-GB"/>
-        </w:rPr>
-      </w:pPr>
-    </w:p>
-    <w:p>
-      <w:pPr>
-        <w:pStyle w:val="Titolo2"/>
-        <w:rPr>
-          <w:lang w:val="it-IT" w:eastAsia="en-GB"/>
-        </w:rPr>
-      </w:pPr>
-      <w:r>
-        <w:rPr>
-          <w:lang w:val="it-IT" w:eastAsia="en-GB"/>
-        </w:rPr>
-        <w:t>Uso dell’integrale</w:t>
-      </w:r>
-    </w:p>
-    <w:p>
-      <w:pPr>
-        <w:rPr>
-          <w:lang w:val="it-IT" w:eastAsia="en-GB"/>
-        </w:rPr>
-      </w:pPr>
-    </w:p>
-    <w:p>
-      <w:pPr>
-        <w:rPr>
-          <w:lang w:val="it-IT" w:eastAsia="en-GB"/>
-        </w:rPr>
-      </w:pPr>
-      <w:proofErr w:type="spellStart"/>
-      <w:r>
-        <w:rPr>
-          <w:lang w:val="it-IT" w:eastAsia="en-GB"/>
-        </w:rPr>
-        <w:t>CLineCalc</w:t>
-      </w:r>
-      <w:proofErr w:type="spellEnd"/>
-      <w:r>
-        <w:rPr>
-          <w:lang w:val="it-IT" w:eastAsia="en-GB"/>
-        </w:rPr>
-        <w:t xml:space="preserve"> di </w:t>
-      </w:r>
-      <w:proofErr w:type="spellStart"/>
-      <w:r>
-        <w:rPr>
-          <w:lang w:val="it-IT" w:eastAsia="en-GB"/>
-        </w:rPr>
-        <w:t>funPlot</w:t>
-      </w:r>
-      <w:proofErr w:type="spellEnd"/>
-      <w:r>
-        <w:rPr>
-          <w:lang w:val="it-IT" w:eastAsia="en-GB"/>
-        </w:rPr>
-        <w:t xml:space="preserve"> non ha il calcolo dell’integrale, il cui codice va q</w:t>
-      </w:r>
-      <w:r>
-        <w:rPr>
-          <w:lang w:val="it-IT" w:eastAsia="en-GB"/>
-        </w:rPr>
-        <w:t>u</w:t>
-      </w:r>
-      <w:r>
-        <w:rPr>
-          <w:lang w:val="it-IT" w:eastAsia="en-GB"/>
-        </w:rPr>
-        <w:t xml:space="preserve">indi estrapolato da analogo codice di </w:t>
-      </w:r>
-      <w:proofErr w:type="spellStart"/>
-      <w:r>
-        <w:rPr>
-          <w:lang w:val="it-IT" w:eastAsia="en-GB"/>
-        </w:rPr>
-        <w:t>CLineCalc</w:t>
-      </w:r>
-      <w:proofErr w:type="spellEnd"/>
-      <w:r>
-        <w:rPr>
-          <w:lang w:val="it-IT" w:eastAsia="en-GB"/>
-        </w:rPr>
-        <w:t xml:space="preserve"> di </w:t>
-      </w:r>
-      <w:proofErr w:type="spellStart"/>
-      <w:r>
-        <w:rPr>
-          <w:lang w:val="it-IT" w:eastAsia="en-GB"/>
-        </w:rPr>
-        <w:t>PlotXY</w:t>
-      </w:r>
-      <w:proofErr w:type="spellEnd"/>
-    </w:p>
-    <w:p>
-      <w:pPr>
-        <w:rPr>
-          <w:lang w:val="it-IT" w:eastAsia="en-GB"/>
-        </w:rPr>
-      </w:pPr>
-    </w:p>
-    <w:p>
-      <w:pPr>
-        <w:rPr>
-          <w:lang w:val="it-IT" w:eastAsia="en-GB"/>
-        </w:rPr>
-      </w:pPr>
-    </w:p>
-    <w:p>
-      <w:pPr>
-        <w:pStyle w:val="Titolo2"/>
-        <w:rPr>
-          <w:lang w:val="it-IT" w:eastAsia="en-GB"/>
-        </w:rPr>
-      </w:pPr>
-      <w:r>
-        <w:rPr>
-          <w:lang w:val="it-IT" w:eastAsia="en-GB"/>
-        </w:rPr>
-        <w:t>Uso delle unità di misura</w:t>
-      </w:r>
-    </w:p>
-    <w:p>
-      <w:pPr>
-        <w:rPr>
-          <w:lang w:val="it-IT" w:eastAsia="en-GB"/>
-        </w:rPr>
-      </w:pPr>
-      <w:proofErr w:type="spellStart"/>
-      <w:r>
-        <w:rPr>
-          <w:lang w:val="it-IT" w:eastAsia="en-GB"/>
-        </w:rPr>
-        <w:t>CLineCalc</w:t>
-      </w:r>
-      <w:proofErr w:type="spellEnd"/>
-      <w:r>
-        <w:rPr>
-          <w:lang w:val="it-IT" w:eastAsia="en-GB"/>
-        </w:rPr>
-        <w:t xml:space="preserve"> di </w:t>
-      </w:r>
-      <w:proofErr w:type="spellStart"/>
-      <w:r>
-        <w:rPr>
-          <w:lang w:val="it-IT" w:eastAsia="en-GB"/>
-        </w:rPr>
-        <w:t>funPlot</w:t>
-      </w:r>
-      <w:proofErr w:type="spellEnd"/>
-      <w:r>
-        <w:rPr>
-          <w:lang w:val="it-IT" w:eastAsia="en-GB"/>
-        </w:rPr>
-        <w:t xml:space="preserve"> non ha il calcolo </w:t>
-      </w:r>
-      <w:r>
-        <w:rPr>
-          <w:lang w:val="it-IT" w:eastAsia="en-GB"/>
-        </w:rPr>
-        <w:t>delle unità di misura</w:t>
-      </w:r>
-      <w:r>
-        <w:rPr>
-          <w:lang w:val="it-IT" w:eastAsia="en-GB"/>
-        </w:rPr>
-        <w:t>, il cui codice va q</w:t>
-      </w:r>
-      <w:r>
-        <w:rPr>
-          <w:lang w:val="it-IT" w:eastAsia="en-GB"/>
-        </w:rPr>
-        <w:t>u</w:t>
-      </w:r>
-      <w:r>
-        <w:rPr>
-          <w:lang w:val="it-IT" w:eastAsia="en-GB"/>
-        </w:rPr>
-        <w:t xml:space="preserve">indi estrapolato da analogo codice di </w:t>
-      </w:r>
-      <w:proofErr w:type="spellStart"/>
-      <w:r>
-        <w:rPr>
-          <w:lang w:val="it-IT" w:eastAsia="en-GB"/>
-        </w:rPr>
-        <w:t>CLineCalc</w:t>
-      </w:r>
-      <w:proofErr w:type="spellEnd"/>
-      <w:r>
-        <w:rPr>
-          <w:lang w:val="it-IT" w:eastAsia="en-GB"/>
-        </w:rPr>
-        <w:t xml:space="preserve"> di </w:t>
-      </w:r>
-      <w:proofErr w:type="spellStart"/>
-      <w:r>
-        <w:rPr>
-          <w:lang w:val="it-IT" w:eastAsia="en-GB"/>
-        </w:rPr>
-        <w:t>PlotXY</w:t>
-      </w:r>
-      <w:proofErr w:type="spellEnd"/>
-    </w:p>
-    <w:p>
-      <w:pPr>
-        <w:rPr>
-          <w:lang w:val="it-IT" w:eastAsia="en-GB"/>
-        </w:rPr>
-      </w:pPr>
-    </w:p>
-    <w:p>
-      <w:pPr>
-        <w:rPr>
-          <w:lang w:val="it-IT" w:eastAsia="en-GB"/>
-        </w:rPr>
-      </w:pPr>
-      <w:r>
-        <w:rPr>
-          <w:lang w:val="it-IT" w:eastAsia="en-GB"/>
-        </w:rPr>
-        <w:t xml:space="preserve">C’è la funzione </w:t>
-      </w:r>
-      <w:proofErr w:type="spellStart"/>
-      <w:proofErr w:type="gramStart"/>
-      <w:r>
-        <w:rPr>
-          <w:lang w:val="it-IT" w:eastAsia="en-GB"/>
-        </w:rPr>
-        <w:t>computeUnits</w:t>
-      </w:r>
-      <w:proofErr w:type="spellEnd"/>
-      <w:r>
-        <w:rPr>
-          <w:lang w:val="it-IT" w:eastAsia="en-GB"/>
-        </w:rPr>
-        <w:t>(</w:t>
-      </w:r>
-      <w:proofErr w:type="gramEnd"/>
-      <w:r>
-        <w:rPr>
-          <w:lang w:val="it-IT" w:eastAsia="en-GB"/>
-        </w:rPr>
-        <w:t xml:space="preserve">) che è chiamata direttamente da </w:t>
-      </w:r>
-      <w:proofErr w:type="spellStart"/>
-      <w:r>
-        <w:rPr>
-          <w:lang w:val="it-IT" w:eastAsia="en-GB"/>
-        </w:rPr>
-        <w:t>CDataSelWin</w:t>
-      </w:r>
-      <w:proofErr w:type="spellEnd"/>
-      <w:r>
-        <w:rPr>
-          <w:lang w:val="it-IT" w:eastAsia="en-GB"/>
-        </w:rPr>
-        <w:t>.</w:t>
+          <w:lang w:val="it-IT" w:eastAsia="en-GB"/>
+        </w:rPr>
+        <w:t>) che è chiamata direttamente da CDataSelWin.</w:t>
       </w:r>
     </w:p>
     <w:p>
@@ -4222,20 +3793,12 @@
       <w:r>
         <w:t xml:space="preserve">Gli unari davanti alle costanti esplicite vengono immediatamente attribuiti alla costante all’interno di </w:t>
       </w:r>
-      <w:proofErr w:type="spellStart"/>
       <w:proofErr w:type="gramStart"/>
       <w:r>
         <w:rPr>
           <w:rFonts w:ascii="Courier New" w:hAnsi="Courier New" w:cs="Courier New"/>
         </w:rPr>
-        <w:t>substPointersToConsts</w:t>
-      </w:r>
-      <w:proofErr w:type="spellEnd"/>
-      <w:r>
-        <w:rPr>
-          <w:rFonts w:ascii="Courier New" w:hAnsi="Courier New" w:cs="Courier New"/>
-        </w:rPr>
-        <w:t>(</w:t>
+        <w:t>substPointersToConsts(</w:t>
       </w:r>
       <w:proofErr w:type="gramEnd"/>
       <w:r>
@@ -4253,7 +3816,6 @@
       <w:r>
         <w:t xml:space="preserve">Gli unari davanti alle variabili e alle parentesi vengono trattati in </w:t>
       </w:r>
-      <w:proofErr w:type="spellStart"/>
       <w:proofErr w:type="gramStart"/>
       <w:r>
         <w:rPr>
@@ -4267,7 +3829,6 @@
         </w:rPr>
         <w:t>PointersToOpers</w:t>
       </w:r>
-      <w:proofErr w:type="spellEnd"/>
       <w:r>
         <w:rPr>
           <w:rFonts w:ascii="Courier New" w:hAnsi="Courier New" w:cs="Courier New"/>
@@ -4284,7 +3845,6 @@
       <w:r>
         <w:t xml:space="preserve">. Ogni unario viene prima riconosciuto. Se è un positivo, il corrispondente carattere viene semplicemente convertito in ‘ ‘. Se è negativo, viene sostituito con il simbolo di operatore unario negativo, ‘-’. La sua elaborazione avviene in </w:t>
       </w:r>
-      <w:proofErr w:type="spellStart"/>
       <w:proofErr w:type="gramStart"/>
       <w:r>
         <w:rPr>
@@ -4298,7 +3858,6 @@
         </w:rPr>
         <w:t>UnaryMinus</w:t>
       </w:r>
-      <w:proofErr w:type="spellEnd"/>
       <w:r>
         <w:rPr>
           <w:rFonts w:ascii="Courier New" w:hAnsi="Courier New" w:cs="Courier New"/>
@@ -4422,20 +3981,12 @@
         </w:rPr>
         <w:t xml:space="preserve"> </w:t>
       </w:r>
-      <w:proofErr w:type="spellStart"/>
       <w:proofErr w:type="gramStart"/>
       <w:r>
         <w:rPr>
           <w:rFonts w:ascii="Courier New" w:hAnsi="Courier New" w:cs="Courier New"/>
         </w:rPr>
-        <w:t>substPointersToConst</w:t>
-      </w:r>
-      <w:proofErr w:type="spellEnd"/>
-      <w:r>
-        <w:rPr>
-          <w:rFonts w:ascii="Courier New" w:hAnsi="Courier New" w:cs="Courier New"/>
-        </w:rPr>
-        <w:t>(</w:t>
+        <w:t>substPointersToConst(</w:t>
       </w:r>
       <w:proofErr w:type="gramEnd"/>
       <w:r>
@@ -4766,20 +4317,12 @@
       <w:r>
         <w:t xml:space="preserve"> </w:t>
       </w:r>
-      <w:proofErr w:type="spellStart"/>
       <w:proofErr w:type="gramStart"/>
       <w:r>
         <w:rPr>
           <w:rFonts w:ascii="Courier New" w:hAnsi="Courier New" w:cs="Courier New"/>
         </w:rPr>
-        <w:t>substPointersToFuns</w:t>
-      </w:r>
-      <w:proofErr w:type="spellEnd"/>
-      <w:r>
-        <w:rPr>
-          <w:rFonts w:ascii="Courier New" w:hAnsi="Courier New" w:cs="Courier New"/>
-        </w:rPr>
-        <w:t>(</w:t>
+        <w:t>substPointersToFuns(</w:t>
       </w:r>
       <w:proofErr w:type="gramEnd"/>
       <w:r>
@@ -5026,20 +4569,12 @@
       <w:r>
         <w:t xml:space="preserve"> </w:t>
       </w:r>
-      <w:proofErr w:type="spellStart"/>
       <w:proofErr w:type="gramStart"/>
       <w:r>
         <w:rPr>
           <w:rFonts w:ascii="Courier New" w:hAnsi="Courier New" w:cs="Courier New"/>
         </w:rPr>
-        <w:t>getVarPointers</w:t>
-      </w:r>
-      <w:proofErr w:type="spellEnd"/>
-      <w:r>
-        <w:rPr>
-          <w:rFonts w:ascii="Courier New" w:hAnsi="Courier New" w:cs="Courier New"/>
-        </w:rPr>
-        <w:t>(</w:t>
+        <w:t>getVarPointers(</w:t>
       </w:r>
       <w:proofErr w:type="gramEnd"/>
       <w:r>
@@ -5353,51 +4888,35 @@
         <w:tab/>
         <w:t xml:space="preserve">si manda in esecuzione </w:t>
       </w:r>
-      <w:proofErr w:type="spellStart"/>
       <w:proofErr w:type="gramStart"/>
       <w:r>
         <w:rPr>
           <w:rFonts w:ascii="Courier New" w:hAnsi="Courier New" w:cs="Courier New"/>
         </w:rPr>
-        <w:t>simplify</w:t>
-      </w:r>
-      <w:proofErr w:type="spellEnd"/>
+        <w:t>simplify(</w:t>
+      </w:r>
+      <w:proofErr w:type="gramEnd"/>
       <w:r>
         <w:rPr>
           <w:rFonts w:ascii="Courier New" w:hAnsi="Courier New" w:cs="Courier New"/>
         </w:rPr>
-        <w:t>(</w:t>
-      </w:r>
-      <w:proofErr w:type="gramEnd"/>
+        <w:t>)</w:t>
+      </w:r>
+      <w:r>
+        <w:t xml:space="preserve"> che fa operazioni di ottimizzazione. L’unica operazione attualmente in programma è l’eliminazione delle coppie di parentesi racchiudenti un unico valore (di tipo ‘#’ o ‘@’). </w:t>
+      </w:r>
+      <w:r>
+        <w:t>Questo</w:t>
+      </w:r>
+      <w:r>
+        <w:t xml:space="preserve"> può essere frequente se si usano le funzioni: ad es. sin(x) prima di </w:t>
+      </w:r>
+      <w:proofErr w:type="gramStart"/>
       <w:r>
         <w:rPr>
           <w:rFonts w:ascii="Courier New" w:hAnsi="Courier New" w:cs="Courier New"/>
         </w:rPr>
-        <w:t>)</w:t>
-      </w:r>
-      <w:r>
-        <w:t xml:space="preserve"> che fa operazioni di ottimizzazione. L’unica operazione attualmente in programma è l’eliminazione delle coppie di parentesi racchiudenti un unico valore (di tipo ‘#’ o ‘@’). </w:t>
-      </w:r>
-      <w:r>
-        <w:t>Questo</w:t>
-      </w:r>
-      <w:r>
-        <w:t xml:space="preserve"> può essere frequente se si usano le funzioni: ad es. sin(x) prima di </w:t>
-      </w:r>
-      <w:proofErr w:type="spellStart"/>
-      <w:proofErr w:type="gramStart"/>
-      <w:r>
-        <w:rPr>
-          <w:rFonts w:ascii="Courier New" w:hAnsi="Courier New" w:cs="Courier New"/>
-        </w:rPr>
-        <w:t>simplify</w:t>
-      </w:r>
-      <w:proofErr w:type="spellEnd"/>
-      <w:r>
-        <w:rPr>
-          <w:rFonts w:ascii="Courier New" w:hAnsi="Courier New" w:cs="Courier New"/>
-        </w:rPr>
-        <w:t>(</w:t>
+        <w:t>simplify(</w:t>
       </w:r>
       <w:proofErr w:type="gramEnd"/>
       <w:r>
@@ -5426,39 +4945,21 @@
         <w:tab/>
         <w:t xml:space="preserve">si manda in esecuzione </w:t>
       </w:r>
-      <w:proofErr w:type="spellStart"/>
       <w:proofErr w:type="gramStart"/>
       <w:r>
-        <w:t>substPointersToOpers</w:t>
-      </w:r>
-      <w:proofErr w:type="spellEnd"/>
-      <w:r>
-        <w:t>(</w:t>
+        <w:t>substPointersToOpers(</w:t>
       </w:r>
       <w:proofErr w:type="gramEnd"/>
       <w:r>
         <w:t xml:space="preserve">). In questa funzione tutti gli operatori binari vengono sostituiti con il carattere ‘+’ mentre l’informazione relativa all’operatore originariamente presente in quella posizione è memorizzata in </w:t>
       </w:r>
-      <w:proofErr w:type="spellStart"/>
       <w:proofErr w:type="gramStart"/>
       <w:r>
-        <w:t>pOper</w:t>
-      </w:r>
-      <w:proofErr w:type="spellEnd"/>
-      <w:r>
-        <w:t>[</w:t>
+        <w:t>pOper[</w:t>
       </w:r>
       <w:proofErr w:type="gramEnd"/>
       <w:r>
-        <w:t xml:space="preserve">]. Si ricorda che i valori di </w:t>
-      </w:r>
-      <w:proofErr w:type="spellStart"/>
-      <w:r>
-        <w:t>pOper</w:t>
-      </w:r>
-      <w:proofErr w:type="spellEnd"/>
-      <w:r>
-        <w:t xml:space="preserve"> sono 0, 1, 2, 3, 4 rispettivamente per ^, *, /. +, -.</w:t>
+        <w:t>]. Si ricorda che i valori di pOper sono 0, 1, 2, 3, 4 rispettivamente per ^, *, /. +, -.</w:t>
       </w:r>
     </w:p>
     <w:p>
@@ -5512,21 +5013,7 @@
         <w:rPr>
           <w:lang w:val="it-IT" w:eastAsia="en-GB"/>
         </w:rPr>
-        <w:t xml:space="preserve"> non si può scambiare la B2 con la B3. Se infatti ad esempio ho una variabile di nome “s” se scambiassi le due fasi sarebbe complicato distinguere “s” del nome di variabile dalla “s” prima lettera di </w:t>
-      </w:r>
-      <w:proofErr w:type="spellStart"/>
-      <w:r>
-        <w:rPr>
-          <w:lang w:val="it-IT" w:eastAsia="en-GB"/>
-        </w:rPr>
-        <w:t>sin</w:t>
-      </w:r>
-      <w:proofErr w:type="spellEnd"/>
-      <w:r>
-        <w:rPr>
-          <w:lang w:val="it-IT" w:eastAsia="en-GB"/>
-        </w:rPr>
-        <w:t xml:space="preserve">;() </w:t>
+        <w:t xml:space="preserve"> non si può scambiare la B2 con la B3. Se infatti ad esempio ho una variabile di nome “s” se scambiassi le due fasi sarebbe complicato distinguere “s” del nome di variabile dalla “s” prima lettera di sin;() </w:t>
       </w:r>
     </w:p>
     <w:p>
@@ -6994,7 +6481,7 @@
 </file>
 
 <file path=word/numbering.xml><?xml version="1.0" encoding="utf-8"?>
-<w:numbering xmlns:wpc="http://schemas.microsoft.com/office/word/2010/wordprocessingCanvas" xmlns:cx="http://schemas.microsoft.com/office/drawing/2014/chartex" xmlns:cx1="http://schemas.microsoft.com/office/drawing/2015/9/8/chartex" xmlns:cx2="http://schemas.microsoft.com/office/drawing/2015/10/21/chartex" xmlns:cx3="http://schemas.microsoft.com/office/drawing/2016/5/9/chartex" xmlns:cx4="http://schemas.microsoft.com/office/drawing/2016/5/10/chartex" xmlns:cx5="http://schemas.microsoft.com/office/drawing/2016/5/11/chartex" xmlns:cx6="http://schemas.microsoft.com/office/drawing/2016/5/12/chartex" xmlns:cx7="http://schemas.microsoft.com/office/drawing/2016/5/13/chartex" xmlns:cx8="http://schemas.microsoft.com/office/drawing/2016/5/14/chartex" xmlns:mc="http://schemas.openxmlformats.org/markup-compatibility/2006" xmlns:aink="http://schemas.microsoft.com/office/drawing/2016/ink" xmlns:am3d="http://schemas.microsoft.com/office/drawing/2017/model3d" xmlns:o="urn:schemas-microsoft-com:office:office" xmlns:r="http://schemas.openxmlformats.org/officeDocument/2006/relationships" xmlns:m="http://schemas.openxmlformats.org/officeDocument/2006/math" xmlns:v="urn:schemas-microsoft-com:vml" xmlns:wp14="http://schemas.microsoft.com/office/word/2010/wordprocessingDrawing" xmlns:wp="http://schemas.openxmlformats.org/drawingml/2006/wordprocessingDrawing" xmlns:w10="urn:schemas-microsoft-com:office:word" xmlns:w="http://schemas.openxmlformats.org/wordprocessingml/2006/main" xmlns:w14="http://schemas.microsoft.com/office/word/2010/wordml" xmlns:w15="http://schemas.microsoft.com/office/word/2012/wordml" xmlns:w16cid="http://schemas.microsoft.com/office/word/2016/wordml/cid" xmlns:w16se="http://schemas.microsoft.com/office/word/2015/wordml/symex" xmlns:wpg="http://schemas.microsoft.com/office/word/2010/wordprocessingGroup" xmlns:wpi="http://schemas.microsoft.com/office/word/2010/wordprocessingInk" xmlns:wne="http://schemas.microsoft.com/office/word/2006/wordml" xmlns:wps="http://schemas.microsoft.com/office/word/2010/wordprocessingShape" mc:Ignorable="w14 w15 w16se w16cid wp14">
+<w:numbering xmlns:wpc="http://schemas.microsoft.com/office/word/2010/wordprocessingCanvas" xmlns:cx="http://schemas.microsoft.com/office/drawing/2014/chartex" xmlns:cx1="http://schemas.microsoft.com/office/drawing/2015/9/8/chartex" xmlns:cx2="http://schemas.microsoft.com/office/drawing/2015/10/21/chartex" xmlns:cx3="http://schemas.microsoft.com/office/drawing/2016/5/9/chartex" xmlns:cx4="http://schemas.microsoft.com/office/drawing/2016/5/10/chartex" xmlns:cx5="http://schemas.microsoft.com/office/drawing/2016/5/11/chartex" xmlns:cx6="http://schemas.microsoft.com/office/drawing/2016/5/12/chartex" xmlns:cx7="http://schemas.microsoft.com/office/drawing/2016/5/13/chartex" xmlns:cx8="http://schemas.microsoft.com/office/drawing/2016/5/14/chartex" xmlns:mc="http://schemas.openxmlformats.org/markup-compatibility/2006" xmlns:aink="http://schemas.microsoft.com/office/drawing/2016/ink" xmlns:am3d="http://schemas.microsoft.com/office/drawing/2017/model3d" xmlns:o="urn:schemas-microsoft-com:office:office" xmlns:oel="http://schemas.microsoft.com/office/2019/extlst" xmlns:r="http://schemas.openxmlformats.org/officeDocument/2006/relationships" xmlns:m="http://schemas.openxmlformats.org/officeDocument/2006/math" xmlns:v="urn:schemas-microsoft-com:vml" xmlns:wp14="http://schemas.microsoft.com/office/word/2010/wordprocessingDrawing" xmlns:wp="http://schemas.openxmlformats.org/drawingml/2006/wordprocessingDrawing" xmlns:w10="urn:schemas-microsoft-com:office:word" xmlns:w="http://schemas.openxmlformats.org/wordprocessingml/2006/main" xmlns:w14="http://schemas.microsoft.com/office/word/2010/wordml" xmlns:w15="http://schemas.microsoft.com/office/word/2012/wordml" xmlns:w16cex="http://schemas.microsoft.com/office/word/2018/wordml/cex" xmlns:w16cid="http://schemas.microsoft.com/office/word/2016/wordml/cid" xmlns:w16="http://schemas.microsoft.com/office/word/2018/wordml" xmlns:w16du="http://schemas.microsoft.com/office/word/2023/wordml/word16du" xmlns:w16sdtdh="http://schemas.microsoft.com/office/word/2020/wordml/sdtdatahash" xmlns:w16se="http://schemas.microsoft.com/office/word/2015/wordml/symex" xmlns:wpg="http://schemas.microsoft.com/office/word/2010/wordprocessingGroup" xmlns:wpi="http://schemas.microsoft.com/office/word/2010/wordprocessingInk" xmlns:wne="http://schemas.microsoft.com/office/word/2006/wordml" xmlns:wps="http://schemas.microsoft.com/office/word/2010/wordprocessingShape" mc:Ignorable="w14 w15 w16se w16cid w16 w16cex w16sdtdh w16du wp14">
   <w:abstractNum w:abstractNumId="0" w15:restartNumberingAfterBreak="0">
     <w:nsid w:val="19091D02"/>
     <w:multiLevelType w:val="hybridMultilevel"/>
@@ -7711,44 +7198,44 @@
       </w:pPr>
     </w:lvl>
   </w:abstractNum>
-  <w:num w:numId="1">
+  <w:num w:numId="1" w16cid:durableId="1072504985">
     <w:abstractNumId w:val="4"/>
   </w:num>
-  <w:num w:numId="2">
+  <w:num w:numId="2" w16cid:durableId="1345131433">
     <w:abstractNumId w:val="3"/>
   </w:num>
-  <w:num w:numId="3">
+  <w:num w:numId="3" w16cid:durableId="434642394">
     <w:abstractNumId w:val="1"/>
   </w:num>
-  <w:num w:numId="4">
+  <w:num w:numId="4" w16cid:durableId="1565141958">
     <w:abstractNumId w:val="0"/>
   </w:num>
-  <w:num w:numId="5">
+  <w:num w:numId="5" w16cid:durableId="1346789747">
     <w:abstractNumId w:val="0"/>
   </w:num>
-  <w:num w:numId="6">
+  <w:num w:numId="6" w16cid:durableId="1776636092">
     <w:abstractNumId w:val="0"/>
   </w:num>
-  <w:num w:numId="7">
+  <w:num w:numId="7" w16cid:durableId="1115293932">
     <w:abstractNumId w:val="0"/>
   </w:num>
-  <w:num w:numId="8">
+  <w:num w:numId="8" w16cid:durableId="1543201735">
     <w:abstractNumId w:val="0"/>
   </w:num>
-  <w:num w:numId="9">
+  <w:num w:numId="9" w16cid:durableId="1509517118">
     <w:abstractNumId w:val="5"/>
   </w:num>
-  <w:num w:numId="10">
+  <w:num w:numId="10" w16cid:durableId="491410931">
     <w:abstractNumId w:val="2"/>
   </w:num>
-  <w:num w:numId="11">
+  <w:num w:numId="11" w16cid:durableId="949508493">
     <w:abstractNumId w:val="6"/>
   </w:num>
 </w:numbering>
 </file>
 
 <file path=word/styles.xml><?xml version="1.0" encoding="utf-8"?>
-<w:styles xmlns:mc="http://schemas.openxmlformats.org/markup-compatibility/2006" xmlns:r="http://schemas.openxmlformats.org/officeDocument/2006/relationships" xmlns:w="http://schemas.openxmlformats.org/wordprocessingml/2006/main" xmlns:w14="http://schemas.microsoft.com/office/word/2010/wordml" xmlns:w15="http://schemas.microsoft.com/office/word/2012/wordml" xmlns:w16cid="http://schemas.microsoft.com/office/word/2016/wordml/cid" xmlns:w16se="http://schemas.microsoft.com/office/word/2015/wordml/symex" mc:Ignorable="w14 w15 w16se w16cid">
+<w:styles xmlns:mc="http://schemas.openxmlformats.org/markup-compatibility/2006" xmlns:r="http://schemas.openxmlformats.org/officeDocument/2006/relationships" xmlns:w="http://schemas.openxmlformats.org/wordprocessingml/2006/main" xmlns:w14="http://schemas.microsoft.com/office/word/2010/wordml" xmlns:w15="http://schemas.microsoft.com/office/word/2012/wordml" xmlns:w16cex="http://schemas.microsoft.com/office/word/2018/wordml/cex" xmlns:w16cid="http://schemas.microsoft.com/office/word/2016/wordml/cid" xmlns:w16="http://schemas.microsoft.com/office/word/2018/wordml" xmlns:w16du="http://schemas.microsoft.com/office/word/2023/wordml/word16du" xmlns:w16sdtdh="http://schemas.microsoft.com/office/word/2020/wordml/sdtdatahash" xmlns:w16se="http://schemas.microsoft.com/office/word/2015/wordml/symex" mc:Ignorable="w14 w15 w16se w16cid w16 w16cex w16sdtdh w16du">
   <w:docDefaults>
     <w:rPrDefault>
       <w:rPr>
@@ -7764,7 +7251,7 @@
       </w:pPr>
     </w:pPrDefault>
   </w:docDefaults>
-  <w:latentStyles w:defLockedState="0" w:defUIPriority="99" w:defSemiHidden="0" w:defUnhideWhenUsed="0" w:defQFormat="0" w:count="375">
+  <w:latentStyles w:defLockedState="0" w:defUIPriority="99" w:defSemiHidden="0" w:defUnhideWhenUsed="0" w:defQFormat="0" w:count="376">
     <w:lsdException w:name="Normal" w:uiPriority="0" w:qFormat="1"/>
     <w:lsdException w:name="heading 1" w:uiPriority="9" w:qFormat="1"/>
     <w:lsdException w:name="heading 2" w:semiHidden="1" w:uiPriority="9" w:unhideWhenUsed="1" w:qFormat="1"/>
@@ -8140,6 +7627,7 @@
     <w:lsdException w:name="Smart Hyperlink" w:semiHidden="1" w:unhideWhenUsed="1"/>
     <w:lsdException w:name="Hashtag" w:semiHidden="1" w:unhideWhenUsed="1"/>
     <w:lsdException w:name="Unresolved Mention" w:semiHidden="1" w:unhideWhenUsed="1"/>
+    <w:lsdException w:name="Smart Link" w:semiHidden="1" w:unhideWhenUsed="1"/>
   </w:latentStyles>
   <w:style w:type="paragraph" w:default="1" w:styleId="Normale">
     <w:name w:val="Normal"/>

</xml_diff>